<commit_message>
Add PowerShell execution-policy step to Tracey's setup guide
New Step 4 (Set-ExecutionPolicy -Scope CurrentUser RemoteSigned) so npm
commands work on a fresh Windows install; later steps renumbered, and
the at-a-glance table and troubleshooting updated to match.

Co-Authored-By: Claude Opus 4.6 <noreply@anthropic.com>
</commit_message>
<xml_diff>
--- a/docs/Gallery-Editor-Setup-and-User-Guide.docx
+++ b/docs/Gallery-Editor-Setup-and-User-Guide.docx
@@ -442,6 +442,23 @@
               <w:t xml:space="preserve">4. </w:t>
             </w:r>
             <w:r>
+              <w:t xml:space="preserve">Allow npm in PowerShell</w:t>
+            </w:r>
+          </w:p>
+          <w:p>
+            <w:pPr>
+              <w:spacing w:after="40"/>
+            </w:pPr>
+            <w:r>
+              <w:rPr>
+                <w:b/>
+                <w:bCs/>
+                <w:i w:val="false"/>
+                <w:iCs w:val="false"/>
+              </w:rPr>
+              <w:t xml:space="preserve">5. </w:t>
+            </w:r>
+            <w:r>
               <w:t xml:space="preserve">Run </w:t>
             </w:r>
             <w:r>
@@ -467,7 +484,7 @@
                 <w:i w:val="false"/>
                 <w:iCs w:val="false"/>
               </w:rPr>
-              <w:t xml:space="preserve">5. </w:t>
+              <w:t xml:space="preserve">6. </w:t>
             </w:r>
             <w:r>
               <w:t xml:space="preserve">Run </w:t>
@@ -1472,7 +1489,24 @@
         <w:pStyle w:val="Heading2"/>
       </w:pPr>
       <w:r>
-        <w:t xml:space="preserve">Step 4 — Install the editor’s components</w:t>
+        <w:t xml:space="preserve">Step 4 — Allow npm to run in PowerShell</w:t>
+      </w:r>
+    </w:p>
+    <w:p>
+      <w:pPr>
+        <w:spacing w:after="120"/>
+      </w:pPr>
+      <w:r>
+        <w:rPr>
+          <w:b/>
+          <w:bCs/>
+          <w:i w:val="false"/>
+          <w:iCs w:val="false"/>
+        </w:rPr>
+        <w:t xml:space="preserve">What it is: </w:t>
+      </w:r>
+      <w:r>
+        <w:t xml:space="preserve">By default, Windows stops PowerShell from running the small helper scripts that npm uses. This one-time setting allows them. Without it, you’ll see an error like “npm.ps1 cannot be loaded because running scripts is disabled on this system.”</w:t>
       </w:r>
     </w:p>
     <w:p>
@@ -1485,35 +1519,7 @@
         <w:spacing w:after="80"/>
       </w:pPr>
       <w:r>
-        <w:t xml:space="preserve">Make sure PowerShell is in the project folder (the line should end with </w:t>
-      </w:r>
-      <w:r>
-        <w:rPr>
-          <w:rFonts w:ascii="Consolas" w:cs="Consolas" w:eastAsia="Consolas" w:hAnsi="Consolas"/>
-          <w:b w:val="false"/>
-          <w:bCs w:val="false"/>
-          <w:i w:val="false"/>
-          <w:iCs w:val="false"/>
-          <w:shd w:fill="F2EFEA" w:val="clear"/>
-        </w:rPr>
-        <w:t xml:space="preserve">quillartbytk</w:t>
-      </w:r>
-      <w:r>
-        <w:t xml:space="preserve">). If not, type </w:t>
-      </w:r>
-      <w:r>
-        <w:rPr>
-          <w:rFonts w:ascii="Consolas" w:cs="Consolas" w:eastAsia="Consolas" w:hAnsi="Consolas"/>
-          <w:b w:val="false"/>
-          <w:bCs w:val="false"/>
-          <w:i w:val="false"/>
-          <w:iCs w:val="false"/>
-          <w:shd w:fill="F2EFEA" w:val="clear"/>
-        </w:rPr>
-        <w:t xml:space="preserve">cd Documents\quillartbytk</w:t>
-      </w:r>
-      <w:r>
-        <w:t xml:space="preserve"> and press Enter.</w:t>
+        <w:t xml:space="preserve">Open a new PowerShell window.</w:t>
       </w:r>
     </w:p>
     <w:p>
@@ -1526,7 +1532,7 @@
         <w:spacing w:after="80"/>
       </w:pPr>
       <w:r>
-        <w:t xml:space="preserve">Type this and press Enter:</w:t>
+        <w:t xml:space="preserve">Type this exactly and press Enter:</w:t>
       </w:r>
     </w:p>
     <w:p>
@@ -1546,7 +1552,7 @@
           <w:sz w:val="21"/>
           <w:szCs w:val="21"/>
         </w:rPr>
-        <w:t xml:space="preserve">npm install</w:t>
+        <w:t xml:space="preserve">Set-ExecutionPolicy -Scope CurrentUser RemoteSigned</w:t>
       </w:r>
     </w:p>
     <w:p>
@@ -1559,7 +1565,75 @@
         <w:spacing w:after="80"/>
       </w:pPr>
       <w:r>
-        <w:t xml:space="preserve">This downloads everything the editor needs. It can take a few minutes and prints a lot of text. Wait until the normal prompt returns. Some yellow </w:t>
+        <w:t xml:space="preserve">When it asks you to confirm, type </w:t>
+      </w:r>
+      <w:r>
+        <w:rPr>
+          <w:b/>
+          <w:bCs/>
+          <w:i w:val="false"/>
+          <w:iCs w:val="false"/>
+        </w:rPr>
+        <w:t xml:space="preserve">Y</w:t>
+      </w:r>
+      <w:r>
+        <w:t xml:space="preserve"> and press Enter.</w:t>
+      </w:r>
+    </w:p>
+    <w:p>
+      <w:pPr>
+        <w:pStyle w:val="ListParagraph"/>
+        <w:numPr>
+          <w:ilvl w:val="0"/>
+          <w:numId w:val="7"/>
+        </w:numPr>
+        <w:spacing w:after="80"/>
+      </w:pPr>
+      <w:r>
+        <w:t xml:space="preserve">That’s all — this only needs to be done once.</w:t>
+      </w:r>
+    </w:p>
+    <w:p>
+      <w:pPr>
+        <w:pBdr>
+          <w:top w:val="single" w:color="EADFAE" w:sz="2" w:space="6"/>
+          <w:bottom w:val="single" w:color="EADFAE" w:sz="2" w:space="6"/>
+          <w:left w:val="single" w:color="4C8C68" w:sz="14" w:space="8"/>
+          <w:right w:val="single" w:color="EADFAE" w:sz="2" w:space="6"/>
+        </w:pBdr>
+        <w:shd w:fill="E9F2EC" w:val="clear"/>
+        <w:spacing w:after="160" w:before="60"/>
+      </w:pPr>
+      <w:r>
+        <w:rPr>
+          <w:b/>
+          <w:bCs/>
+        </w:rPr>
+        <w:t xml:space="preserve">Is this safe?  </w:t>
+      </w:r>
+      <w:r>
+        <w:t xml:space="preserve">Yes. It affects only your own account and simply lets trusted scripts already on your laptop (such as npm’s) run. It doesn’t lower any other security on the laptop.</w:t>
+      </w:r>
+    </w:p>
+    <w:p>
+      <w:pPr>
+        <w:pStyle w:val="Heading2"/>
+      </w:pPr>
+      <w:r>
+        <w:t xml:space="preserve">Step 5 — Install the editor’s components</w:t>
+      </w:r>
+    </w:p>
+    <w:p>
+      <w:pPr>
+        <w:pStyle w:val="ListParagraph"/>
+        <w:numPr>
+          <w:ilvl w:val="0"/>
+          <w:numId w:val="8"/>
+        </w:numPr>
+        <w:spacing w:after="80"/>
+      </w:pPr>
+      <w:r>
+        <w:t xml:space="preserve">Make sure PowerShell is in the project folder (the line should end with </w:t>
       </w:r>
       <w:r>
         <w:rPr>
@@ -1570,39 +1644,10 @@
           <w:iCs w:val="false"/>
           <w:shd w:fill="F2EFEA" w:val="clear"/>
         </w:rPr>
-        <w:t xml:space="preserve">warning</w:t>
-      </w:r>
-      <w:r>
-        <w:t xml:space="preserve"> messages are normal and can be ignored.</w:t>
-      </w:r>
-    </w:p>
-    <w:p>
-      <w:pPr>
-        <w:pStyle w:val="Heading2"/>
-      </w:pPr>
-      <w:r>
-        <w:t xml:space="preserve">Step 5 — Create your editor login</w:t>
-      </w:r>
-    </w:p>
-    <w:p>
-      <w:pPr>
-        <w:spacing w:after="120"/>
-      </w:pPr>
-      <w:r>
-        <w:t xml:space="preserve">This sets the username and password you’ll use to open the editor. It is separate from any other password you have.</w:t>
-      </w:r>
-    </w:p>
-    <w:p>
-      <w:pPr>
-        <w:pStyle w:val="ListParagraph"/>
-        <w:numPr>
-          <w:ilvl w:val="0"/>
-          <w:numId w:val="8"/>
-        </w:numPr>
-        <w:spacing w:after="80"/>
-      </w:pPr>
-      <w:r>
-        <w:t xml:space="preserve">In the same PowerShell window (still in the </w:t>
+        <w:t xml:space="preserve">quillartbytk</w:t>
+      </w:r>
+      <w:r>
+        <w:t xml:space="preserve">). If not, type </w:t>
       </w:r>
       <w:r>
         <w:rPr>
@@ -1613,10 +1658,23 @@
           <w:iCs w:val="false"/>
           <w:shd w:fill="F2EFEA" w:val="clear"/>
         </w:rPr>
-        <w:t xml:space="preserve">quillartbytk</w:t>
-      </w:r>
-      <w:r>
-        <w:t xml:space="preserve"> folder), type:</w:t>
+        <w:t xml:space="preserve">cd Documents\quillartbytk</w:t>
+      </w:r>
+      <w:r>
+        <w:t xml:space="preserve"> and press Enter.</w:t>
+      </w:r>
+    </w:p>
+    <w:p>
+      <w:pPr>
+        <w:pStyle w:val="ListParagraph"/>
+        <w:numPr>
+          <w:ilvl w:val="0"/>
+          <w:numId w:val="8"/>
+        </w:numPr>
+        <w:spacing w:after="80"/>
+      </w:pPr>
+      <w:r>
+        <w:t xml:space="preserve">Type this and press Enter:</w:t>
       </w:r>
     </w:p>
     <w:p>
@@ -1636,7 +1694,7 @@
           <w:sz w:val="21"/>
           <w:szCs w:val="21"/>
         </w:rPr>
-        <w:t xml:space="preserve">npm run admin:setup</w:t>
+        <w:t xml:space="preserve">npm install</w:t>
       </w:r>
     </w:p>
     <w:p>
@@ -1649,7 +1707,7 @@
         <w:spacing w:after="80"/>
       </w:pPr>
       <w:r>
-        <w:t xml:space="preserve">When it asks </w:t>
+        <w:t xml:space="preserve">This downloads everything the editor needs. It can take a few minutes and prints a lot of text. Wait until the normal prompt returns. Some yellow </w:t>
       </w:r>
       <w:r>
         <w:rPr>
@@ -1660,10 +1718,39 @@
           <w:iCs w:val="false"/>
           <w:shd w:fill="F2EFEA" w:val="clear"/>
         </w:rPr>
-        <w:t xml:space="preserve">Choose a username:</w:t>
-      </w:r>
-      <w:r>
-        <w:t xml:space="preserve"> type a username (for example, </w:t>
+        <w:t xml:space="preserve">warning</w:t>
+      </w:r>
+      <w:r>
+        <w:t xml:space="preserve"> messages are normal and can be ignored.</w:t>
+      </w:r>
+    </w:p>
+    <w:p>
+      <w:pPr>
+        <w:pStyle w:val="Heading2"/>
+      </w:pPr>
+      <w:r>
+        <w:t xml:space="preserve">Step 6 — Create your editor login</w:t>
+      </w:r>
+    </w:p>
+    <w:p>
+      <w:pPr>
+        <w:spacing w:after="120"/>
+      </w:pPr>
+      <w:r>
+        <w:t xml:space="preserve">This sets the username and password you’ll use to open the editor. It is separate from any other password you have.</w:t>
+      </w:r>
+    </w:p>
+    <w:p>
+      <w:pPr>
+        <w:pStyle w:val="ListParagraph"/>
+        <w:numPr>
+          <w:ilvl w:val="0"/>
+          <w:numId w:val="9"/>
+        </w:numPr>
+        <w:spacing w:after="80"/>
+      </w:pPr>
+      <w:r>
+        <w:t xml:space="preserve">In the same PowerShell window (still in the </w:t>
       </w:r>
       <w:r>
         <w:rPr>
@@ -1674,18 +1761,38 @@
           <w:iCs w:val="false"/>
           <w:shd w:fill="F2EFEA" w:val="clear"/>
         </w:rPr>
-        <w:t xml:space="preserve">tracey</w:t>
-      </w:r>
-      <w:r>
-        <w:t xml:space="preserve">) and press Enter.</w:t>
-      </w:r>
-    </w:p>
-    <w:p>
-      <w:pPr>
-        <w:pStyle w:val="ListParagraph"/>
-        <w:numPr>
-          <w:ilvl w:val="0"/>
-          <w:numId w:val="8"/>
+        <w:t xml:space="preserve">quillartbytk</w:t>
+      </w:r>
+      <w:r>
+        <w:t xml:space="preserve"> folder), type:</w:t>
+      </w:r>
+    </w:p>
+    <w:p>
+      <w:pPr>
+        <w:pBdr>
+          <w:top w:val="single" w:color="E0DAD2" w:sz="2" w:space="6"/>
+          <w:bottom w:val="single" w:color="E0DAD2" w:sz="2" w:space="6"/>
+          <w:left w:val="single" w:color="9C3B5E" w:sz="12" w:space="8"/>
+          <w:right w:val="single" w:color="E0DAD2" w:sz="2" w:space="6"/>
+        </w:pBdr>
+        <w:shd w:fill="F2EFEA" w:val="clear"/>
+        <w:spacing w:after="140" w:before="60"/>
+      </w:pPr>
+      <w:r>
+        <w:rPr>
+          <w:rFonts w:ascii="Consolas" w:cs="Consolas" w:eastAsia="Consolas" w:hAnsi="Consolas"/>
+          <w:sz w:val="21"/>
+          <w:szCs w:val="21"/>
+        </w:rPr>
+        <w:t xml:space="preserve">npm run admin:setup</w:t>
+      </w:r>
+    </w:p>
+    <w:p>
+      <w:pPr>
+        <w:pStyle w:val="ListParagraph"/>
+        <w:numPr>
+          <w:ilvl w:val="0"/>
+          <w:numId w:val="9"/>
         </w:numPr>
         <w:spacing w:after="80"/>
       </w:pPr>
@@ -1701,6 +1808,47 @@
           <w:iCs w:val="false"/>
           <w:shd w:fill="F2EFEA" w:val="clear"/>
         </w:rPr>
+        <w:t xml:space="preserve">Choose a username:</w:t>
+      </w:r>
+      <w:r>
+        <w:t xml:space="preserve"> type a username (for example, </w:t>
+      </w:r>
+      <w:r>
+        <w:rPr>
+          <w:rFonts w:ascii="Consolas" w:cs="Consolas" w:eastAsia="Consolas" w:hAnsi="Consolas"/>
+          <w:b w:val="false"/>
+          <w:bCs w:val="false"/>
+          <w:i w:val="false"/>
+          <w:iCs w:val="false"/>
+          <w:shd w:fill="F2EFEA" w:val="clear"/>
+        </w:rPr>
+        <w:t xml:space="preserve">tracey</w:t>
+      </w:r>
+      <w:r>
+        <w:t xml:space="preserve">) and press Enter.</w:t>
+      </w:r>
+    </w:p>
+    <w:p>
+      <w:pPr>
+        <w:pStyle w:val="ListParagraph"/>
+        <w:numPr>
+          <w:ilvl w:val="0"/>
+          <w:numId w:val="9"/>
+        </w:numPr>
+        <w:spacing w:after="80"/>
+      </w:pPr>
+      <w:r>
+        <w:t xml:space="preserve">When it asks </w:t>
+      </w:r>
+      <w:r>
+        <w:rPr>
+          <w:rFonts w:ascii="Consolas" w:cs="Consolas" w:eastAsia="Consolas" w:hAnsi="Consolas"/>
+          <w:b w:val="false"/>
+          <w:bCs w:val="false"/>
+          <w:i w:val="false"/>
+          <w:iCs w:val="false"/>
+          <w:shd w:fill="F2EFEA" w:val="clear"/>
+        </w:rPr>
         <w:t xml:space="preserve">Choose a password:</w:t>
       </w:r>
       <w:r>
@@ -1712,7 +1860,7 @@
         <w:pStyle w:val="ListParagraph"/>
         <w:numPr>
           <w:ilvl w:val="0"/>
-          <w:numId w:val="8"/>
+          <w:numId w:val="9"/>
         </w:numPr>
         <w:spacing w:after="80"/>
       </w:pPr>
@@ -1725,7 +1873,7 @@
         <w:pStyle w:val="ListParagraph"/>
         <w:numPr>
           <w:ilvl w:val="0"/>
-          <w:numId w:val="8"/>
+          <w:numId w:val="9"/>
         </w:numPr>
         <w:spacing w:after="80"/>
       </w:pPr>
@@ -1774,7 +1922,7 @@
         <w:pStyle w:val="Heading2"/>
       </w:pPr>
       <w:r>
-        <w:t xml:space="preserve">Step 6 — A quick test run (recommended)</w:t>
+        <w:t xml:space="preserve">Step 7 — A quick test run (recommended)</w:t>
       </w:r>
     </w:p>
     <w:p>
@@ -1790,7 +1938,7 @@
         <w:pStyle w:val="ListParagraph"/>
         <w:numPr>
           <w:ilvl w:val="0"/>
-          <w:numId w:val="9"/>
+          <w:numId w:val="10"/>
         </w:numPr>
         <w:spacing w:after="80"/>
       </w:pPr>
@@ -1837,7 +1985,7 @@
         <w:pStyle w:val="ListParagraph"/>
         <w:numPr>
           <w:ilvl w:val="0"/>
-          <w:numId w:val="9"/>
+          <w:numId w:val="10"/>
         </w:numPr>
         <w:spacing w:after="80"/>
       </w:pPr>
@@ -1864,7 +2012,7 @@
         <w:pStyle w:val="ListParagraph"/>
         <w:numPr>
           <w:ilvl w:val="0"/>
-          <w:numId w:val="9"/>
+          <w:numId w:val="10"/>
         </w:numPr>
         <w:spacing w:after="80"/>
       </w:pPr>
@@ -1891,7 +2039,7 @@
         <w:pStyle w:val="ListParagraph"/>
         <w:numPr>
           <w:ilvl w:val="0"/>
-          <w:numId w:val="9"/>
+          <w:numId w:val="10"/>
         </w:numPr>
         <w:spacing w:after="80"/>
       </w:pPr>
@@ -1904,7 +2052,7 @@
         <w:pStyle w:val="ListParagraph"/>
         <w:numPr>
           <w:ilvl w:val="0"/>
-          <w:numId w:val="9"/>
+          <w:numId w:val="10"/>
         </w:numPr>
         <w:spacing w:after="80"/>
       </w:pPr>
@@ -1962,7 +2110,7 @@
         <w:pStyle w:val="ListParagraph"/>
         <w:numPr>
           <w:ilvl w:val="0"/>
-          <w:numId w:val="10"/>
+          <w:numId w:val="11"/>
         </w:numPr>
         <w:spacing w:after="80"/>
       </w:pPr>
@@ -1999,7 +2147,7 @@
         <w:pStyle w:val="ListParagraph"/>
         <w:numPr>
           <w:ilvl w:val="0"/>
-          <w:numId w:val="10"/>
+          <w:numId w:val="11"/>
         </w:numPr>
         <w:spacing w:after="80"/>
       </w:pPr>
@@ -2032,7 +2180,7 @@
         <w:pStyle w:val="ListParagraph"/>
         <w:numPr>
           <w:ilvl w:val="0"/>
-          <w:numId w:val="10"/>
+          <w:numId w:val="11"/>
         </w:numPr>
         <w:spacing w:after="80"/>
       </w:pPr>
@@ -2065,7 +2213,7 @@
         <w:pStyle w:val="ListParagraph"/>
         <w:numPr>
           <w:ilvl w:val="0"/>
-          <w:numId w:val="10"/>
+          <w:numId w:val="11"/>
         </w:numPr>
         <w:spacing w:after="80"/>
       </w:pPr>
@@ -2092,7 +2240,7 @@
         <w:pStyle w:val="ListParagraph"/>
         <w:numPr>
           <w:ilvl w:val="0"/>
-          <w:numId w:val="10"/>
+          <w:numId w:val="11"/>
         </w:numPr>
         <w:spacing w:after="80"/>
       </w:pPr>
@@ -2119,7 +2267,7 @@
         <w:pStyle w:val="ListParagraph"/>
         <w:numPr>
           <w:ilvl w:val="0"/>
-          <w:numId w:val="10"/>
+          <w:numId w:val="11"/>
         </w:numPr>
         <w:spacing w:after="80"/>
       </w:pPr>
@@ -2314,7 +2462,7 @@
         <w:pStyle w:val="ListParagraph"/>
         <w:numPr>
           <w:ilvl w:val="0"/>
-          <w:numId w:val="11"/>
+          <w:numId w:val="12"/>
         </w:numPr>
         <w:spacing w:after="80"/>
       </w:pPr>
@@ -2327,7 +2475,7 @@
         <w:pStyle w:val="ListParagraph"/>
         <w:numPr>
           <w:ilvl w:val="0"/>
-          <w:numId w:val="11"/>
+          <w:numId w:val="12"/>
         </w:numPr>
         <w:spacing w:after="80"/>
       </w:pPr>
@@ -2340,7 +2488,7 @@
         <w:pStyle w:val="ListParagraph"/>
         <w:numPr>
           <w:ilvl w:val="0"/>
-          <w:numId w:val="11"/>
+          <w:numId w:val="12"/>
         </w:numPr>
         <w:spacing w:after="80"/>
       </w:pPr>
@@ -2748,7 +2896,7 @@
         <w:pStyle w:val="ListParagraph"/>
         <w:numPr>
           <w:ilvl w:val="0"/>
-          <w:numId w:val="12"/>
+          <w:numId w:val="13"/>
         </w:numPr>
         <w:spacing w:after="80"/>
       </w:pPr>
@@ -2773,7 +2921,7 @@
         <w:pStyle w:val="ListParagraph"/>
         <w:numPr>
           <w:ilvl w:val="0"/>
-          <w:numId w:val="12"/>
+          <w:numId w:val="13"/>
         </w:numPr>
         <w:spacing w:after="80"/>
       </w:pPr>
@@ -2798,7 +2946,7 @@
         <w:pStyle w:val="ListParagraph"/>
         <w:numPr>
           <w:ilvl w:val="0"/>
-          <w:numId w:val="12"/>
+          <w:numId w:val="13"/>
         </w:numPr>
         <w:spacing w:after="80"/>
       </w:pPr>
@@ -2811,7 +2959,7 @@
         <w:pStyle w:val="ListParagraph"/>
         <w:numPr>
           <w:ilvl w:val="0"/>
-          <w:numId w:val="12"/>
+          <w:numId w:val="13"/>
         </w:numPr>
         <w:spacing w:after="80"/>
       </w:pPr>
@@ -2836,7 +2984,7 @@
         <w:pStyle w:val="ListParagraph"/>
         <w:numPr>
           <w:ilvl w:val="0"/>
-          <w:numId w:val="12"/>
+          <w:numId w:val="13"/>
         </w:numPr>
         <w:spacing w:after="80"/>
       </w:pPr>
@@ -2885,7 +3033,7 @@
         <w:pStyle w:val="ListParagraph"/>
         <w:numPr>
           <w:ilvl w:val="0"/>
-          <w:numId w:val="12"/>
+          <w:numId w:val="13"/>
         </w:numPr>
         <w:spacing w:after="80"/>
       </w:pPr>
@@ -2928,7 +3076,7 @@
         <w:pStyle w:val="ListParagraph"/>
         <w:numPr>
           <w:ilvl w:val="0"/>
-          <w:numId w:val="13"/>
+          <w:numId w:val="14"/>
         </w:numPr>
         <w:spacing w:after="80"/>
       </w:pPr>
@@ -2953,7 +3101,7 @@
         <w:pStyle w:val="ListParagraph"/>
         <w:numPr>
           <w:ilvl w:val="0"/>
-          <w:numId w:val="13"/>
+          <w:numId w:val="14"/>
         </w:numPr>
         <w:spacing w:after="80"/>
       </w:pPr>
@@ -2966,7 +3114,7 @@
         <w:pStyle w:val="ListParagraph"/>
         <w:numPr>
           <w:ilvl w:val="0"/>
-          <w:numId w:val="13"/>
+          <w:numId w:val="14"/>
         </w:numPr>
         <w:spacing w:after="80"/>
       </w:pPr>
@@ -2979,7 +3127,7 @@
         <w:pStyle w:val="ListParagraph"/>
         <w:numPr>
           <w:ilvl w:val="0"/>
-          <w:numId w:val="13"/>
+          <w:numId w:val="14"/>
         </w:numPr>
         <w:spacing w:after="80"/>
       </w:pPr>
@@ -3024,7 +3172,7 @@
         <w:pStyle w:val="ListParagraph"/>
         <w:numPr>
           <w:ilvl w:val="0"/>
-          <w:numId w:val="14"/>
+          <w:numId w:val="15"/>
         </w:numPr>
         <w:spacing w:after="80"/>
       </w:pPr>
@@ -3049,7 +3197,7 @@
         <w:pStyle w:val="ListParagraph"/>
         <w:numPr>
           <w:ilvl w:val="0"/>
-          <w:numId w:val="14"/>
+          <w:numId w:val="15"/>
         </w:numPr>
         <w:spacing w:after="80"/>
       </w:pPr>
@@ -3062,7 +3210,7 @@
         <w:pStyle w:val="ListParagraph"/>
         <w:numPr>
           <w:ilvl w:val="0"/>
-          <w:numId w:val="14"/>
+          <w:numId w:val="15"/>
         </w:numPr>
         <w:spacing w:after="80"/>
       </w:pPr>
@@ -3084,7 +3232,7 @@
         <w:pStyle w:val="ListParagraph"/>
         <w:numPr>
           <w:ilvl w:val="0"/>
-          <w:numId w:val="14"/>
+          <w:numId w:val="15"/>
         </w:numPr>
         <w:spacing w:after="80"/>
       </w:pPr>
@@ -3139,7 +3287,7 @@
         <w:pStyle w:val="ListParagraph"/>
         <w:numPr>
           <w:ilvl w:val="0"/>
-          <w:numId w:val="15"/>
+          <w:numId w:val="16"/>
         </w:numPr>
         <w:spacing w:after="80"/>
       </w:pPr>
@@ -3152,7 +3300,7 @@
         <w:pStyle w:val="ListParagraph"/>
         <w:numPr>
           <w:ilvl w:val="0"/>
-          <w:numId w:val="15"/>
+          <w:numId w:val="16"/>
         </w:numPr>
         <w:spacing w:after="80"/>
       </w:pPr>
@@ -3189,7 +3337,7 @@
         <w:pStyle w:val="ListParagraph"/>
         <w:numPr>
           <w:ilvl w:val="0"/>
-          <w:numId w:val="15"/>
+          <w:numId w:val="16"/>
         </w:numPr>
         <w:spacing w:after="80"/>
       </w:pPr>
@@ -3346,6 +3494,54 @@
       </w:r>
       <w:r>
         <w:t xml:space="preserve">Close PowerShell and open a fresh window (newly installed software is only picked up by new windows). If it still happens, re-run the relevant install step.</w:t>
+      </w:r>
+    </w:p>
+    <w:p>
+      <w:pPr>
+        <w:pStyle w:val="ListParagraph"/>
+        <w:numPr>
+          <w:ilvl w:val="0"/>
+          <w:numId w:val="2"/>
+        </w:numPr>
+        <w:spacing w:after="80"/>
+      </w:pPr>
+      <w:r>
+        <w:rPr>
+          <w:b/>
+          <w:bCs/>
+          <w:i w:val="false"/>
+          <w:iCs w:val="false"/>
+        </w:rPr>
+        <w:t xml:space="preserve">“Running scripts is disabled on this system”: </w:t>
+      </w:r>
+      <w:r>
+        <w:t xml:space="preserve">You haven’t done Step 4 yet. Run </w:t>
+      </w:r>
+      <w:r>
+        <w:rPr>
+          <w:rFonts w:ascii="Consolas" w:cs="Consolas" w:eastAsia="Consolas" w:hAnsi="Consolas"/>
+          <w:b w:val="false"/>
+          <w:bCs w:val="false"/>
+          <w:i w:val="false"/>
+          <w:iCs w:val="false"/>
+          <w:shd w:fill="F2EFEA" w:val="clear"/>
+        </w:rPr>
+        <w:t xml:space="preserve">Set-ExecutionPolicy -Scope CurrentUser RemoteSigned</w:t>
+      </w:r>
+      <w:r>
+        <w:t xml:space="preserve"> in PowerShell, press </w:t>
+      </w:r>
+      <w:r>
+        <w:rPr>
+          <w:b/>
+          <w:bCs/>
+          <w:i w:val="false"/>
+          <w:iCs w:val="false"/>
+        </w:rPr>
+        <w:t xml:space="preserve">Y</w:t>
+      </w:r>
+      <w:r>
+        <w:t xml:space="preserve">, then try again.</w:t>
       </w:r>
     </w:p>
     <w:p>
@@ -4545,6 +4741,12 @@
   </w:num>
   <w:num w:numId="15">
     <w:abstractNumId w:val="14"/>
+    <w:lvlOverride w:ilvl="0">
+      <w:startOverride w:val="1"/>
+    </w:lvlOverride>
+  </w:num>
+  <w:num w:numId="16">
+    <w:abstractNumId w:val="15"/>
     <w:lvlOverride w:ilvl="0">
       <w:startOverride w:val="1"/>
     </w:lvlOverride>

</xml_diff>

<commit_message>
Add VS Code and git-identity steps to Tracey's setup guide
New Step 2 (install VS Code, before Git so it can be chosen as Git's
default editor) and Step 4 (git config user.name/email, fixing the
"Author identity unknown" error on first save). Git step now covers
selecting VS Code as the editor; later steps renumbered; at-a-glance
table and troubleshooting updated (incl. the "Session Expired" =
wrong-login note).

Co-Authored-By: Claude Opus 4.8 (1M context) <noreply@anthropic.com>
</commit_message>
<xml_diff>
--- a/docs/Gallery-Editor-Setup-and-User-Guide.docx
+++ b/docs/Gallery-Editor-Setup-and-User-Guide.docx
@@ -408,7 +408,7 @@
               <w:t xml:space="preserve">2. </w:t>
             </w:r>
             <w:r>
-              <w:t xml:space="preserve">Install Git</w:t>
+              <w:t xml:space="preserve">Install VS Code</w:t>
             </w:r>
           </w:p>
           <w:p>
@@ -425,7 +425,7 @@
               <w:t xml:space="preserve">3. </w:t>
             </w:r>
             <w:r>
-              <w:t xml:space="preserve">Download the website files</w:t>
+              <w:t xml:space="preserve">Install Git</w:t>
             </w:r>
           </w:p>
           <w:p>
@@ -442,6 +442,40 @@
               <w:t xml:space="preserve">4. </w:t>
             </w:r>
             <w:r>
+              <w:t xml:space="preserve">Tell Git who you are</w:t>
+            </w:r>
+          </w:p>
+          <w:p>
+            <w:pPr>
+              <w:spacing w:after="40"/>
+            </w:pPr>
+            <w:r>
+              <w:rPr>
+                <w:b/>
+                <w:bCs/>
+                <w:i w:val="false"/>
+                <w:iCs w:val="false"/>
+              </w:rPr>
+              <w:t xml:space="preserve">5. </w:t>
+            </w:r>
+            <w:r>
+              <w:t xml:space="preserve">Download the website files</w:t>
+            </w:r>
+          </w:p>
+          <w:p>
+            <w:pPr>
+              <w:spacing w:after="40"/>
+            </w:pPr>
+            <w:r>
+              <w:rPr>
+                <w:b/>
+                <w:bCs/>
+                <w:i w:val="false"/>
+                <w:iCs w:val="false"/>
+              </w:rPr>
+              <w:t xml:space="preserve">6. </w:t>
+            </w:r>
+            <w:r>
               <w:t xml:space="preserve">Allow npm in PowerShell</w:t>
             </w:r>
           </w:p>
@@ -456,7 +490,7 @@
                 <w:i w:val="false"/>
                 <w:iCs w:val="false"/>
               </w:rPr>
-              <w:t xml:space="preserve">5. </w:t>
+              <w:t xml:space="preserve">7. </w:t>
             </w:r>
             <w:r>
               <w:t xml:space="preserve">Run </w:t>
@@ -484,7 +518,7 @@
                 <w:i w:val="false"/>
                 <w:iCs w:val="false"/>
               </w:rPr>
-              <w:t xml:space="preserve">6. </w:t>
+              <w:t xml:space="preserve">8. </w:t>
             </w:r>
             <w:r>
               <w:t xml:space="preserve">Run </w:t>
@@ -1052,7 +1086,7 @@
         <w:pStyle w:val="Heading2"/>
       </w:pPr>
       <w:r>
-        <w:t xml:space="preserve">Step 2 — Install Git</w:t>
+        <w:t xml:space="preserve">Step 2 — Install VS Code</w:t>
       </w:r>
     </w:p>
     <w:p>
@@ -1069,7 +1103,7 @@
         <w:t xml:space="preserve">What it is: </w:t>
       </w:r>
       <w:r>
-        <w:t xml:space="preserve">Git downloads the website files and sends your changes back when you publish.</w:t>
+        <w:t xml:space="preserve">VS Code is a free text editor from Microsoft. Git uses it as its built-in editor, and it’s handy for opening the website files if you ever need to. Install it now — before Git — so you can choose it during the Git setup in the next step.</w:t>
       </w:r>
     </w:p>
     <w:p>
@@ -1093,6 +1127,120 @@
           <w:iCs w:val="false"/>
           <w:shd w:fill="F2EFEA" w:val="clear"/>
         </w:rPr>
+        <w:t xml:space="preserve">https://code.visualstudio.com</w:t>
+      </w:r>
+      <w:r>
+        <w:t xml:space="preserve">.</w:t>
+      </w:r>
+    </w:p>
+    <w:p>
+      <w:pPr>
+        <w:pStyle w:val="ListParagraph"/>
+        <w:numPr>
+          <w:ilvl w:val="0"/>
+          <w:numId w:val="5"/>
+        </w:numPr>
+        <w:spacing w:after="80"/>
+      </w:pPr>
+      <w:r>
+        <w:t xml:space="preserve">Click the blue </w:t>
+      </w:r>
+      <w:r>
+        <w:rPr>
+          <w:b/>
+          <w:bCs/>
+          <w:i w:val="false"/>
+          <w:iCs w:val="false"/>
+        </w:rPr>
+        <w:t xml:space="preserve">Download for Windows</w:t>
+      </w:r>
+      <w:r>
+        <w:t xml:space="preserve"> button.</w:t>
+      </w:r>
+    </w:p>
+    <w:p>
+      <w:pPr>
+        <w:pStyle w:val="ListParagraph"/>
+        <w:numPr>
+          <w:ilvl w:val="0"/>
+          <w:numId w:val="5"/>
+        </w:numPr>
+        <w:spacing w:after="80"/>
+      </w:pPr>
+      <w:r>
+        <w:t xml:space="preserve">Open the downloaded file and click through the installer, accepting the defaults. Click </w:t>
+      </w:r>
+      <w:r>
+        <w:rPr>
+          <w:b/>
+          <w:bCs/>
+          <w:i w:val="false"/>
+          <w:iCs w:val="false"/>
+        </w:rPr>
+        <w:t xml:space="preserve">Install</w:t>
+      </w:r>
+      <w:r>
+        <w:t xml:space="preserve">, then </w:t>
+      </w:r>
+      <w:r>
+        <w:rPr>
+          <w:b/>
+          <w:bCs/>
+          <w:i w:val="false"/>
+          <w:iCs w:val="false"/>
+        </w:rPr>
+        <w:t xml:space="preserve">Finish</w:t>
+      </w:r>
+      <w:r>
+        <w:t xml:space="preserve">.</w:t>
+      </w:r>
+    </w:p>
+    <w:p>
+      <w:pPr>
+        <w:pStyle w:val="Heading2"/>
+      </w:pPr>
+      <w:r>
+        <w:t xml:space="preserve">Step 3 — Install Git</w:t>
+      </w:r>
+    </w:p>
+    <w:p>
+      <w:pPr>
+        <w:spacing w:after="120"/>
+      </w:pPr>
+      <w:r>
+        <w:rPr>
+          <w:b/>
+          <w:bCs/>
+          <w:i w:val="false"/>
+          <w:iCs w:val="false"/>
+        </w:rPr>
+        <w:t xml:space="preserve">What it is: </w:t>
+      </w:r>
+      <w:r>
+        <w:t xml:space="preserve">Git downloads the website files and sends your changes back when you publish.</w:t>
+      </w:r>
+    </w:p>
+    <w:p>
+      <w:pPr>
+        <w:pStyle w:val="ListParagraph"/>
+        <w:numPr>
+          <w:ilvl w:val="0"/>
+          <w:numId w:val="6"/>
+        </w:numPr>
+        <w:spacing w:after="80"/>
+      </w:pPr>
+      <w:r>
+        <w:t xml:space="preserve">In your browser, go to </w:t>
+      </w:r>
+      <w:r>
+        <w:rPr>
+          <w:rFonts w:ascii="Consolas" w:cs="Consolas" w:eastAsia="Consolas" w:hAnsi="Consolas"/>
+          <w:b w:val="false"/>
+          <w:bCs w:val="false"/>
+          <w:i w:val="false"/>
+          <w:iCs w:val="false"/>
+          <w:shd w:fill="F2EFEA" w:val="clear"/>
+        </w:rPr>
         <w:t xml:space="preserve">https://git-scm.com/download/win</w:t>
       </w:r>
       <w:r>
@@ -1104,7 +1252,7 @@
         <w:pStyle w:val="ListParagraph"/>
         <w:numPr>
           <w:ilvl w:val="0"/>
-          <w:numId w:val="5"/>
+          <w:numId w:val="6"/>
         </w:numPr>
         <w:spacing w:after="80"/>
       </w:pPr>
@@ -1117,7 +1265,7 @@
         <w:pStyle w:val="ListParagraph"/>
         <w:numPr>
           <w:ilvl w:val="0"/>
-          <w:numId w:val="5"/>
+          <w:numId w:val="6"/>
         </w:numPr>
         <w:spacing w:after="80"/>
       </w:pPr>
@@ -1142,7 +1290,32 @@
         <w:pStyle w:val="ListParagraph"/>
         <w:numPr>
           <w:ilvl w:val="0"/>
-          <w:numId w:val="5"/>
+          <w:numId w:val="6"/>
+        </w:numPr>
+        <w:spacing w:after="80"/>
+      </w:pPr>
+      <w:r>
+        <w:t xml:space="preserve">On the screen titled “Choosing the default editor used by Git”, open the dropdown and choose </w:t>
+      </w:r>
+      <w:r>
+        <w:rPr>
+          <w:b/>
+          <w:bCs/>
+          <w:i w:val="false"/>
+          <w:iCs w:val="false"/>
+        </w:rPr>
+        <w:t xml:space="preserve">Use Visual Studio Code as Git’s default editor</w:t>
+      </w:r>
+      <w:r>
+        <w:t xml:space="preserve">. (This is why VS Code was installed first.)</w:t>
+      </w:r>
+    </w:p>
+    <w:p>
+      <w:pPr>
+        <w:pStyle w:val="ListParagraph"/>
+        <w:numPr>
+          <w:ilvl w:val="0"/>
+          <w:numId w:val="6"/>
         </w:numPr>
         <w:spacing w:after="80"/>
       </w:pPr>
@@ -1179,7 +1352,7 @@
         <w:pStyle w:val="ListParagraph"/>
         <w:numPr>
           <w:ilvl w:val="0"/>
-          <w:numId w:val="5"/>
+          <w:numId w:val="6"/>
         </w:numPr>
         <w:spacing w:after="80"/>
       </w:pPr>
@@ -1204,7 +1377,7 @@
         <w:pStyle w:val="ListParagraph"/>
         <w:numPr>
           <w:ilvl w:val="0"/>
-          <w:numId w:val="5"/>
+          <w:numId w:val="6"/>
         </w:numPr>
         <w:spacing w:after="80"/>
       </w:pPr>
@@ -1285,7 +1458,7 @@
         <w:t xml:space="preserve">Important — signing in to GitHub:  </w:t>
       </w:r>
       <w:r>
-        <w:t xml:space="preserve">The first time you download the files (Step 3) or the first time you publish, a GitHub sign-in window may appear. Sign in with the GitHub account that has access to the website. This usually only happens once.</w:t>
+        <w:t xml:space="preserve">The first time you download the files (Step 5) or the first time you publish, a GitHub sign-in window may appear. Sign in with the GitHub account that has access to the website. This usually only happens once.</w:t>
       </w:r>
     </w:p>
     <w:p>
@@ -1293,15 +1466,32 @@
         <w:pStyle w:val="Heading2"/>
       </w:pPr>
       <w:r>
-        <w:t xml:space="preserve">Step 3 — Download the website files</w:t>
-      </w:r>
-    </w:p>
-    <w:p>
-      <w:pPr>
-        <w:pStyle w:val="ListParagraph"/>
-        <w:numPr>
-          <w:ilvl w:val="0"/>
-          <w:numId w:val="6"/>
+        <w:t xml:space="preserve">Step 4 — Tell Git who you are</w:t>
+      </w:r>
+    </w:p>
+    <w:p>
+      <w:pPr>
+        <w:spacing w:after="120"/>
+      </w:pPr>
+      <w:r>
+        <w:rPr>
+          <w:b/>
+          <w:bCs/>
+          <w:i w:val="false"/>
+          <w:iCs w:val="false"/>
+        </w:rPr>
+        <w:t xml:space="preserve">What it is: </w:t>
+      </w:r>
+      <w:r>
+        <w:t xml:space="preserve">Git stamps every saved change with a name and email. A fresh install doesn’t know yours yet, so the first time you save an edit you’d see an error like “Author identity unknown”. Setting this once fixes it.</w:t>
+      </w:r>
+    </w:p>
+    <w:p>
+      <w:pPr>
+        <w:pStyle w:val="ListParagraph"/>
+        <w:numPr>
+          <w:ilvl w:val="0"/>
+          <w:numId w:val="7"/>
         </w:numPr>
         <w:spacing w:after="80"/>
       </w:pPr>
@@ -1314,7 +1504,103 @@
         <w:pStyle w:val="ListParagraph"/>
         <w:numPr>
           <w:ilvl w:val="0"/>
-          <w:numId w:val="6"/>
+          <w:numId w:val="7"/>
+        </w:numPr>
+        <w:spacing w:after="80"/>
+      </w:pPr>
+      <w:r>
+        <w:t xml:space="preserve">Type these two lines one at a time, pressing Enter after each. Put your own name and the email you used for your GitHub account between the quote marks:</w:t>
+      </w:r>
+    </w:p>
+    <w:p>
+      <w:pPr>
+        <w:pBdr>
+          <w:top w:val="single" w:color="E0DAD2" w:sz="2" w:space="6"/>
+          <w:bottom w:val="single" w:color="E0DAD2" w:sz="2" w:space="6"/>
+          <w:left w:val="single" w:color="9C3B5E" w:sz="12" w:space="8"/>
+          <w:right w:val="single" w:color="E0DAD2" w:sz="2" w:space="6"/>
+        </w:pBdr>
+        <w:shd w:fill="F2EFEA" w:val="clear"/>
+        <w:spacing w:after="0" w:before="60"/>
+      </w:pPr>
+      <w:r>
+        <w:rPr>
+          <w:rFonts w:ascii="Consolas" w:cs="Consolas" w:eastAsia="Consolas" w:hAnsi="Consolas"/>
+          <w:sz w:val="21"/>
+          <w:szCs w:val="21"/>
+        </w:rPr>
+        <w:t xml:space="preserve">git config --global user.name "Tracey"</w:t>
+      </w:r>
+    </w:p>
+    <w:p>
+      <w:pPr>
+        <w:pBdr>
+          <w:top w:val="single" w:color="E0DAD2" w:sz="2" w:space="6"/>
+          <w:bottom w:val="single" w:color="E0DAD2" w:sz="2" w:space="6"/>
+          <w:left w:val="single" w:color="9C3B5E" w:sz="12" w:space="8"/>
+          <w:right w:val="single" w:color="E0DAD2" w:sz="2" w:space="6"/>
+        </w:pBdr>
+        <w:shd w:fill="F2EFEA" w:val="clear"/>
+        <w:spacing w:after="140" w:before="0"/>
+      </w:pPr>
+      <w:r>
+        <w:rPr>
+          <w:rFonts w:ascii="Consolas" w:cs="Consolas" w:eastAsia="Consolas" w:hAnsi="Consolas"/>
+          <w:sz w:val="21"/>
+          <w:szCs w:val="21"/>
+        </w:rPr>
+        <w:t xml:space="preserve">git config --global user.email "you@example.com"</w:t>
+      </w:r>
+    </w:p>
+    <w:p>
+      <w:pPr>
+        <w:pBdr>
+          <w:top w:val="single" w:color="EADFAE" w:sz="2" w:space="6"/>
+          <w:bottom w:val="single" w:color="EADFAE" w:sz="2" w:space="6"/>
+          <w:left w:val="single" w:color="4C8C68" w:sz="14" w:space="8"/>
+          <w:right w:val="single" w:color="EADFAE" w:sz="2" w:space="6"/>
+        </w:pBdr>
+        <w:shd w:fill="E9F2EC" w:val="clear"/>
+        <w:spacing w:after="160" w:before="60"/>
+      </w:pPr>
+      <w:r>
+        <w:rPr>
+          <w:b/>
+          <w:bCs/>
+        </w:rPr>
+        <w:t xml:space="preserve">Tip:  </w:t>
+      </w:r>
+      <w:r>
+        <w:t xml:space="preserve">Use the email address you signed up to GitHub with, so your changes show up as yours. Nothing appears on screen after these commands — that’s normal; it just means they worked.</w:t>
+      </w:r>
+    </w:p>
+    <w:p>
+      <w:pPr>
+        <w:pStyle w:val="Heading2"/>
+      </w:pPr>
+      <w:r>
+        <w:t xml:space="preserve">Step 5 — Download the website files</w:t>
+      </w:r>
+    </w:p>
+    <w:p>
+      <w:pPr>
+        <w:pStyle w:val="ListParagraph"/>
+        <w:numPr>
+          <w:ilvl w:val="0"/>
+          <w:numId w:val="8"/>
+        </w:numPr>
+        <w:spacing w:after="80"/>
+      </w:pPr>
+      <w:r>
+        <w:t xml:space="preserve">Open a new PowerShell window.</w:t>
+      </w:r>
+    </w:p>
+    <w:p>
+      <w:pPr>
+        <w:pStyle w:val="ListParagraph"/>
+        <w:numPr>
+          <w:ilvl w:val="0"/>
+          <w:numId w:val="8"/>
         </w:numPr>
         <w:spacing w:after="80"/>
       </w:pPr>
@@ -1347,7 +1633,7 @@
         <w:pStyle w:val="ListParagraph"/>
         <w:numPr>
           <w:ilvl w:val="0"/>
-          <w:numId w:val="6"/>
+          <w:numId w:val="8"/>
         </w:numPr>
         <w:spacing w:after="80"/>
       </w:pPr>
@@ -1380,7 +1666,7 @@
         <w:pStyle w:val="ListParagraph"/>
         <w:numPr>
           <w:ilvl w:val="0"/>
-          <w:numId w:val="6"/>
+          <w:numId w:val="8"/>
         </w:numPr>
         <w:spacing w:after="80"/>
       </w:pPr>
@@ -1393,7 +1679,7 @@
         <w:pStyle w:val="ListParagraph"/>
         <w:numPr>
           <w:ilvl w:val="0"/>
-          <w:numId w:val="6"/>
+          <w:numId w:val="8"/>
         </w:numPr>
         <w:spacing w:after="80"/>
       </w:pPr>
@@ -1420,7 +1706,7 @@
         <w:pStyle w:val="ListParagraph"/>
         <w:numPr>
           <w:ilvl w:val="0"/>
-          <w:numId w:val="6"/>
+          <w:numId w:val="8"/>
         </w:numPr>
         <w:spacing w:after="80"/>
       </w:pPr>
@@ -1489,7 +1775,7 @@
         <w:pStyle w:val="Heading2"/>
       </w:pPr>
       <w:r>
-        <w:t xml:space="preserve">Step 4 — Allow npm to run in PowerShell</w:t>
+        <w:t xml:space="preserve">Step 6 — Allow npm to run in PowerShell</w:t>
       </w:r>
     </w:p>
     <w:p>
@@ -1514,7 +1800,7 @@
         <w:pStyle w:val="ListParagraph"/>
         <w:numPr>
           <w:ilvl w:val="0"/>
-          <w:numId w:val="7"/>
+          <w:numId w:val="9"/>
         </w:numPr>
         <w:spacing w:after="80"/>
       </w:pPr>
@@ -1527,7 +1813,7 @@
         <w:pStyle w:val="ListParagraph"/>
         <w:numPr>
           <w:ilvl w:val="0"/>
-          <w:numId w:val="7"/>
+          <w:numId w:val="9"/>
         </w:numPr>
         <w:spacing w:after="80"/>
       </w:pPr>
@@ -1560,7 +1846,7 @@
         <w:pStyle w:val="ListParagraph"/>
         <w:numPr>
           <w:ilvl w:val="0"/>
-          <w:numId w:val="7"/>
+          <w:numId w:val="9"/>
         </w:numPr>
         <w:spacing w:after="80"/>
       </w:pPr>
@@ -1585,7 +1871,7 @@
         <w:pStyle w:val="ListParagraph"/>
         <w:numPr>
           <w:ilvl w:val="0"/>
-          <w:numId w:val="7"/>
+          <w:numId w:val="9"/>
         </w:numPr>
         <w:spacing w:after="80"/>
       </w:pPr>
@@ -1620,15 +1906,15 @@
         <w:pStyle w:val="Heading2"/>
       </w:pPr>
       <w:r>
-        <w:t xml:space="preserve">Step 5 — Install the editor’s components</w:t>
-      </w:r>
-    </w:p>
-    <w:p>
-      <w:pPr>
-        <w:pStyle w:val="ListParagraph"/>
-        <w:numPr>
-          <w:ilvl w:val="0"/>
-          <w:numId w:val="8"/>
+        <w:t xml:space="preserve">Step 7 — Install the editor’s components</w:t>
+      </w:r>
+    </w:p>
+    <w:p>
+      <w:pPr>
+        <w:pStyle w:val="ListParagraph"/>
+        <w:numPr>
+          <w:ilvl w:val="0"/>
+          <w:numId w:val="10"/>
         </w:numPr>
         <w:spacing w:after="80"/>
       </w:pPr>
@@ -1669,7 +1955,7 @@
         <w:pStyle w:val="ListParagraph"/>
         <w:numPr>
           <w:ilvl w:val="0"/>
-          <w:numId w:val="8"/>
+          <w:numId w:val="10"/>
         </w:numPr>
         <w:spacing w:after="80"/>
       </w:pPr>
@@ -1702,7 +1988,7 @@
         <w:pStyle w:val="ListParagraph"/>
         <w:numPr>
           <w:ilvl w:val="0"/>
-          <w:numId w:val="8"/>
+          <w:numId w:val="10"/>
         </w:numPr>
         <w:spacing w:after="80"/>
       </w:pPr>
@@ -1729,7 +2015,7 @@
         <w:pStyle w:val="Heading2"/>
       </w:pPr>
       <w:r>
-        <w:t xml:space="preserve">Step 6 — Create your editor login</w:t>
+        <w:t xml:space="preserve">Step 8 — Create your editor login</w:t>
       </w:r>
     </w:p>
     <w:p>
@@ -1745,7 +2031,7 @@
         <w:pStyle w:val="ListParagraph"/>
         <w:numPr>
           <w:ilvl w:val="0"/>
-          <w:numId w:val="9"/>
+          <w:numId w:val="11"/>
         </w:numPr>
         <w:spacing w:after="80"/>
       </w:pPr>
@@ -1792,7 +2078,7 @@
         <w:pStyle w:val="ListParagraph"/>
         <w:numPr>
           <w:ilvl w:val="0"/>
-          <w:numId w:val="9"/>
+          <w:numId w:val="11"/>
         </w:numPr>
         <w:spacing w:after="80"/>
       </w:pPr>
@@ -1833,7 +2119,7 @@
         <w:pStyle w:val="ListParagraph"/>
         <w:numPr>
           <w:ilvl w:val="0"/>
-          <w:numId w:val="9"/>
+          <w:numId w:val="11"/>
         </w:numPr>
         <w:spacing w:after="80"/>
       </w:pPr>
@@ -1860,7 +2146,7 @@
         <w:pStyle w:val="ListParagraph"/>
         <w:numPr>
           <w:ilvl w:val="0"/>
-          <w:numId w:val="9"/>
+          <w:numId w:val="11"/>
         </w:numPr>
         <w:spacing w:after="80"/>
       </w:pPr>
@@ -1873,7 +2159,7 @@
         <w:pStyle w:val="ListParagraph"/>
         <w:numPr>
           <w:ilvl w:val="0"/>
-          <w:numId w:val="9"/>
+          <w:numId w:val="11"/>
         </w:numPr>
         <w:spacing w:after="80"/>
       </w:pPr>
@@ -1922,7 +2208,7 @@
         <w:pStyle w:val="Heading2"/>
       </w:pPr>
       <w:r>
-        <w:t xml:space="preserve">Step 7 — A quick test run (recommended)</w:t>
+        <w:t xml:space="preserve">Step 9 — A quick test run (recommended)</w:t>
       </w:r>
     </w:p>
     <w:p>
@@ -1938,7 +2224,7 @@
         <w:pStyle w:val="ListParagraph"/>
         <w:numPr>
           <w:ilvl w:val="0"/>
-          <w:numId w:val="10"/>
+          <w:numId w:val="12"/>
         </w:numPr>
         <w:spacing w:after="80"/>
       </w:pPr>
@@ -1985,7 +2271,7 @@
         <w:pStyle w:val="ListParagraph"/>
         <w:numPr>
           <w:ilvl w:val="0"/>
-          <w:numId w:val="10"/>
+          <w:numId w:val="12"/>
         </w:numPr>
         <w:spacing w:after="80"/>
       </w:pPr>
@@ -2012,7 +2298,7 @@
         <w:pStyle w:val="ListParagraph"/>
         <w:numPr>
           <w:ilvl w:val="0"/>
-          <w:numId w:val="10"/>
+          <w:numId w:val="12"/>
         </w:numPr>
         <w:spacing w:after="80"/>
       </w:pPr>
@@ -2039,7 +2325,7 @@
         <w:pStyle w:val="ListParagraph"/>
         <w:numPr>
           <w:ilvl w:val="0"/>
-          <w:numId w:val="10"/>
+          <w:numId w:val="12"/>
         </w:numPr>
         <w:spacing w:after="80"/>
       </w:pPr>
@@ -2052,7 +2338,7 @@
         <w:pStyle w:val="ListParagraph"/>
         <w:numPr>
           <w:ilvl w:val="0"/>
-          <w:numId w:val="10"/>
+          <w:numId w:val="12"/>
         </w:numPr>
         <w:spacing w:after="80"/>
       </w:pPr>
@@ -2110,7 +2396,7 @@
         <w:pStyle w:val="ListParagraph"/>
         <w:numPr>
           <w:ilvl w:val="0"/>
-          <w:numId w:val="11"/>
+          <w:numId w:val="13"/>
         </w:numPr>
         <w:spacing w:after="80"/>
       </w:pPr>
@@ -2147,7 +2433,7 @@
         <w:pStyle w:val="ListParagraph"/>
         <w:numPr>
           <w:ilvl w:val="0"/>
-          <w:numId w:val="11"/>
+          <w:numId w:val="13"/>
         </w:numPr>
         <w:spacing w:after="80"/>
       </w:pPr>
@@ -2180,7 +2466,7 @@
         <w:pStyle w:val="ListParagraph"/>
         <w:numPr>
           <w:ilvl w:val="0"/>
-          <w:numId w:val="11"/>
+          <w:numId w:val="13"/>
         </w:numPr>
         <w:spacing w:after="80"/>
       </w:pPr>
@@ -2213,7 +2499,7 @@
         <w:pStyle w:val="ListParagraph"/>
         <w:numPr>
           <w:ilvl w:val="0"/>
-          <w:numId w:val="11"/>
+          <w:numId w:val="13"/>
         </w:numPr>
         <w:spacing w:after="80"/>
       </w:pPr>
@@ -2240,7 +2526,7 @@
         <w:pStyle w:val="ListParagraph"/>
         <w:numPr>
           <w:ilvl w:val="0"/>
-          <w:numId w:val="11"/>
+          <w:numId w:val="13"/>
         </w:numPr>
         <w:spacing w:after="80"/>
       </w:pPr>
@@ -2267,7 +2553,7 @@
         <w:pStyle w:val="ListParagraph"/>
         <w:numPr>
           <w:ilvl w:val="0"/>
-          <w:numId w:val="11"/>
+          <w:numId w:val="13"/>
         </w:numPr>
         <w:spacing w:after="80"/>
       </w:pPr>
@@ -2462,7 +2748,7 @@
         <w:pStyle w:val="ListParagraph"/>
         <w:numPr>
           <w:ilvl w:val="0"/>
-          <w:numId w:val="12"/>
+          <w:numId w:val="14"/>
         </w:numPr>
         <w:spacing w:after="80"/>
       </w:pPr>
@@ -2475,7 +2761,7 @@
         <w:pStyle w:val="ListParagraph"/>
         <w:numPr>
           <w:ilvl w:val="0"/>
-          <w:numId w:val="12"/>
+          <w:numId w:val="14"/>
         </w:numPr>
         <w:spacing w:after="80"/>
       </w:pPr>
@@ -2488,7 +2774,7 @@
         <w:pStyle w:val="ListParagraph"/>
         <w:numPr>
           <w:ilvl w:val="0"/>
-          <w:numId w:val="12"/>
+          <w:numId w:val="14"/>
         </w:numPr>
         <w:spacing w:after="80"/>
       </w:pPr>
@@ -2896,7 +3182,7 @@
         <w:pStyle w:val="ListParagraph"/>
         <w:numPr>
           <w:ilvl w:val="0"/>
-          <w:numId w:val="13"/>
+          <w:numId w:val="15"/>
         </w:numPr>
         <w:spacing w:after="80"/>
       </w:pPr>
@@ -2921,7 +3207,7 @@
         <w:pStyle w:val="ListParagraph"/>
         <w:numPr>
           <w:ilvl w:val="0"/>
-          <w:numId w:val="13"/>
+          <w:numId w:val="15"/>
         </w:numPr>
         <w:spacing w:after="80"/>
       </w:pPr>
@@ -2946,7 +3232,7 @@
         <w:pStyle w:val="ListParagraph"/>
         <w:numPr>
           <w:ilvl w:val="0"/>
-          <w:numId w:val="13"/>
+          <w:numId w:val="15"/>
         </w:numPr>
         <w:spacing w:after="80"/>
       </w:pPr>
@@ -2959,7 +3245,7 @@
         <w:pStyle w:val="ListParagraph"/>
         <w:numPr>
           <w:ilvl w:val="0"/>
-          <w:numId w:val="13"/>
+          <w:numId w:val="15"/>
         </w:numPr>
         <w:spacing w:after="80"/>
       </w:pPr>
@@ -2984,7 +3270,7 @@
         <w:pStyle w:val="ListParagraph"/>
         <w:numPr>
           <w:ilvl w:val="0"/>
-          <w:numId w:val="13"/>
+          <w:numId w:val="15"/>
         </w:numPr>
         <w:spacing w:after="80"/>
       </w:pPr>
@@ -3033,7 +3319,7 @@
         <w:pStyle w:val="ListParagraph"/>
         <w:numPr>
           <w:ilvl w:val="0"/>
-          <w:numId w:val="13"/>
+          <w:numId w:val="15"/>
         </w:numPr>
         <w:spacing w:after="80"/>
       </w:pPr>
@@ -3076,7 +3362,7 @@
         <w:pStyle w:val="ListParagraph"/>
         <w:numPr>
           <w:ilvl w:val="0"/>
-          <w:numId w:val="14"/>
+          <w:numId w:val="16"/>
         </w:numPr>
         <w:spacing w:after="80"/>
       </w:pPr>
@@ -3101,7 +3387,7 @@
         <w:pStyle w:val="ListParagraph"/>
         <w:numPr>
           <w:ilvl w:val="0"/>
-          <w:numId w:val="14"/>
+          <w:numId w:val="16"/>
         </w:numPr>
         <w:spacing w:after="80"/>
       </w:pPr>
@@ -3114,7 +3400,7 @@
         <w:pStyle w:val="ListParagraph"/>
         <w:numPr>
           <w:ilvl w:val="0"/>
-          <w:numId w:val="14"/>
+          <w:numId w:val="16"/>
         </w:numPr>
         <w:spacing w:after="80"/>
       </w:pPr>
@@ -3127,7 +3413,7 @@
         <w:pStyle w:val="ListParagraph"/>
         <w:numPr>
           <w:ilvl w:val="0"/>
-          <w:numId w:val="14"/>
+          <w:numId w:val="16"/>
         </w:numPr>
         <w:spacing w:after="80"/>
       </w:pPr>
@@ -3172,7 +3458,7 @@
         <w:pStyle w:val="ListParagraph"/>
         <w:numPr>
           <w:ilvl w:val="0"/>
-          <w:numId w:val="15"/>
+          <w:numId w:val="17"/>
         </w:numPr>
         <w:spacing w:after="80"/>
       </w:pPr>
@@ -3197,7 +3483,7 @@
         <w:pStyle w:val="ListParagraph"/>
         <w:numPr>
           <w:ilvl w:val="0"/>
-          <w:numId w:val="15"/>
+          <w:numId w:val="17"/>
         </w:numPr>
         <w:spacing w:after="80"/>
       </w:pPr>
@@ -3210,7 +3496,7 @@
         <w:pStyle w:val="ListParagraph"/>
         <w:numPr>
           <w:ilvl w:val="0"/>
-          <w:numId w:val="15"/>
+          <w:numId w:val="17"/>
         </w:numPr>
         <w:spacing w:after="80"/>
       </w:pPr>
@@ -3232,7 +3518,7 @@
         <w:pStyle w:val="ListParagraph"/>
         <w:numPr>
           <w:ilvl w:val="0"/>
-          <w:numId w:val="15"/>
+          <w:numId w:val="17"/>
         </w:numPr>
         <w:spacing w:after="80"/>
       </w:pPr>
@@ -3287,7 +3573,7 @@
         <w:pStyle w:val="ListParagraph"/>
         <w:numPr>
           <w:ilvl w:val="0"/>
-          <w:numId w:val="16"/>
+          <w:numId w:val="18"/>
         </w:numPr>
         <w:spacing w:after="80"/>
       </w:pPr>
@@ -3300,7 +3586,7 @@
         <w:pStyle w:val="ListParagraph"/>
         <w:numPr>
           <w:ilvl w:val="0"/>
-          <w:numId w:val="16"/>
+          <w:numId w:val="18"/>
         </w:numPr>
         <w:spacing w:after="80"/>
       </w:pPr>
@@ -3337,7 +3623,7 @@
         <w:pStyle w:val="ListParagraph"/>
         <w:numPr>
           <w:ilvl w:val="0"/>
-          <w:numId w:val="16"/>
+          <w:numId w:val="18"/>
         </w:numPr>
         <w:spacing w:after="80"/>
       </w:pPr>
@@ -3515,7 +3801,7 @@
         <w:t xml:space="preserve">“Running scripts is disabled on this system”: </w:t>
       </w:r>
       <w:r>
-        <w:t xml:space="preserve">You haven’t done Step 4 yet. Run </w:t>
+        <w:t xml:space="preserve">You haven’t done Step 6 yet. Run </w:t>
       </w:r>
       <w:r>
         <w:rPr>
@@ -3542,6 +3828,78 @@
       </w:r>
       <w:r>
         <w:t xml:space="preserve">, then try again.</w:t>
+      </w:r>
+    </w:p>
+    <w:p>
+      <w:pPr>
+        <w:pStyle w:val="ListParagraph"/>
+        <w:numPr>
+          <w:ilvl w:val="0"/>
+          <w:numId w:val="2"/>
+        </w:numPr>
+        <w:spacing w:after="80"/>
+      </w:pPr>
+      <w:r>
+        <w:rPr>
+          <w:b/>
+          <w:bCs/>
+          <w:i w:val="false"/>
+          <w:iCs w:val="false"/>
+        </w:rPr>
+        <w:t xml:space="preserve">“Author identity unknown” when you save an edit: </w:t>
+      </w:r>
+      <w:r>
+        <w:t xml:space="preserve">You haven’t done Step 4 yet. Run the two </w:t>
+      </w:r>
+      <w:r>
+        <w:rPr>
+          <w:rFonts w:ascii="Consolas" w:cs="Consolas" w:eastAsia="Consolas" w:hAnsi="Consolas"/>
+          <w:b w:val="false"/>
+          <w:bCs w:val="false"/>
+          <w:i w:val="false"/>
+          <w:iCs w:val="false"/>
+          <w:shd w:fill="F2EFEA" w:val="clear"/>
+        </w:rPr>
+        <w:t xml:space="preserve">git config --global</w:t>
+      </w:r>
+      <w:r>
+        <w:t xml:space="preserve"> lines from that step, then save again.</w:t>
+      </w:r>
+    </w:p>
+    <w:p>
+      <w:pPr>
+        <w:pStyle w:val="ListParagraph"/>
+        <w:numPr>
+          <w:ilvl w:val="0"/>
+          <w:numId w:val="2"/>
+        </w:numPr>
+        <w:spacing w:after="80"/>
+      </w:pPr>
+      <w:r>
+        <w:rPr>
+          <w:b/>
+          <w:bCs/>
+          <w:i w:val="false"/>
+          <w:iCs w:val="false"/>
+        </w:rPr>
+        <w:t xml:space="preserve">“Session Expired” on the login screen: </w:t>
+      </w:r>
+      <w:r>
+        <w:t xml:space="preserve">This actually means the username or password didn’t match. Re-run </w:t>
+      </w:r>
+      <w:r>
+        <w:rPr>
+          <w:rFonts w:ascii="Consolas" w:cs="Consolas" w:eastAsia="Consolas" w:hAnsi="Consolas"/>
+          <w:b w:val="false"/>
+          <w:bCs w:val="false"/>
+          <w:i w:val="false"/>
+          <w:iCs w:val="false"/>
+          <w:shd w:fill="F2EFEA" w:val="clear"/>
+        </w:rPr>
+        <w:t xml:space="preserve">npm run admin:setup</w:t>
+      </w:r>
+      <w:r>
+        <w:t xml:space="preserve"> to set a fresh login (watch Caps Lock — the password doesn’t show as you type), then sign in with exactly those.</w:t>
       </w:r>
     </w:p>
     <w:p>
@@ -4747,6 +5105,18 @@
   </w:num>
   <w:num w:numId="16">
     <w:abstractNumId w:val="15"/>
+    <w:lvlOverride w:ilvl="0">
+      <w:startOverride w:val="1"/>
+    </w:lvlOverride>
+  </w:num>
+  <w:num w:numId="17">
+    <w:abstractNumId w:val="16"/>
+    <w:lvlOverride w:ilvl="0">
+      <w:startOverride w:val="1"/>
+    </w:lvlOverride>
+  </w:num>
+  <w:num w:numId="18">
+    <w:abstractNumId w:val="17"/>
     <w:lvlOverride w:ilvl="0">
       <w:startOverride w:val="1"/>
     </w:lvlOverride>

</xml_diff>

<commit_message>
docs: document the Collections tab + empty-collection behaviour
- README: new Collections notes (member order = site order, empty
  collections hidden everywhere), "Four tabs" with a Collections
  entry, and two quick-reference rows.
- Gallery-Editor-Setup-and-User-Guide.docx: add a plain-English
  "The Collections tab — grouping pieces" section (choosing a
  collection, add/remove/reorder, hidden/awaiting-photos pieces,
  making a new collection) and update the tab overview to four tabs.

Co-Authored-By: Claude Opus 4.8 <noreply@anthropic.com>
</commit_message>
<xml_diff>
--- a/docs/Gallery-Editor-Setup-and-User-Guide.docx
+++ b/docs/Gallery-Editor-Setup-and-User-Guide.docx
@@ -1,5 +1,36 @@
 
-<file path=word/document.xml><?xml version="1.0" encoding="utf-8"?>
+<file path=docProps\app.xml><?xml version="1.0" encoding="utf-8"?>
+<Properties xmlns="http://schemas.openxmlformats.org/officeDocument/2006/extended-properties" xmlns:vt="http://schemas.openxmlformats.org/officeDocument/2006/docPropsVTypes">
+  <Template>Normal.dotm</Template>
+  <TotalTime>1</TotalTime>
+  <Pages>11</Pages>
+  <Words>3186</Words>
+  <Characters>18161</Characters>
+  <Application>Microsoft Office Word</Application>
+  <DocSecurity>0</DocSecurity>
+  <Lines>151</Lines>
+  <Paragraphs>42</Paragraphs>
+  <ScaleCrop>false</ScaleCrop>
+  <Company/>
+  <LinksUpToDate>false</LinksUpToDate>
+  <CharactersWithSpaces>21305</CharactersWithSpaces>
+  <SharedDoc>false</SharedDoc>
+  <HyperlinksChanged>false</HyperlinksChanged>
+  <AppVersion>16.0000</AppVersion>
+</Properties>
+</file>
+
+<file path=docProps\core.xml><?xml version="1.0" encoding="utf-8"?>
+<cp:coreProperties xmlns:cp="http://schemas.openxmlformats.org/package/2006/metadata/core-properties" xmlns:dc="http://purl.org/dc/elements/1.1/" xmlns:dcterms="http://purl.org/dc/terms/" xmlns:dcmitype="http://purl.org/dc/dcmitype/" xmlns:xsi="http://www.w3.org/2001/XMLSchema-instance">
+  <dc:creator>Un-named</dc:creator>
+  <cp:lastModifiedBy>Gavin Keeley</cp:lastModifiedBy>
+  <cp:revision>2</cp:revision>
+  <dcterms:created xsi:type="dcterms:W3CDTF">2026-06-18T09:55:00Z</dcterms:created>
+  <dcterms:modified xsi:type="dcterms:W3CDTF">2026-06-18T09:55:00Z</dcterms:modified>
+</cp:coreProperties>
+</file>
+
+<file path=word\document.xml><?xml version="1.0" encoding="utf-8"?>
 <w:document xmlns:wpc="http://schemas.microsoft.com/office/word/2010/wordprocessingCanvas" xmlns:cx="http://schemas.microsoft.com/office/drawing/2014/chartex" xmlns:cx1="http://schemas.microsoft.com/office/drawing/2015/9/8/chartex" xmlns:cx2="http://schemas.microsoft.com/office/drawing/2015/10/21/chartex" xmlns:cx3="http://schemas.microsoft.com/office/drawing/2016/5/9/chartex" xmlns:cx4="http://schemas.microsoft.com/office/drawing/2016/5/10/chartex" xmlns:cx5="http://schemas.microsoft.com/office/drawing/2016/5/11/chartex" xmlns:cx6="http://schemas.microsoft.com/office/drawing/2016/5/12/chartex" xmlns:cx7="http://schemas.microsoft.com/office/drawing/2016/5/13/chartex" xmlns:cx8="http://schemas.microsoft.com/office/drawing/2016/5/14/chartex" xmlns:mc="http://schemas.openxmlformats.org/markup-compatibility/2006" xmlns:aink="http://schemas.microsoft.com/office/drawing/2016/ink" xmlns:am3d="http://schemas.microsoft.com/office/drawing/2017/model3d" xmlns:o="urn:schemas-microsoft-com:office:office" xmlns:oel="http://schemas.microsoft.com/office/2019/extlst" xmlns:r="http://schemas.openxmlformats.org/officeDocument/2006/relationships" xmlns:m="http://schemas.openxmlformats.org/officeDocument/2006/math" xmlns:v="urn:schemas-microsoft-com:vml" xmlns:wp14="http://schemas.microsoft.com/office/word/2010/wordprocessingDrawing" xmlns:wp="http://schemas.openxmlformats.org/drawingml/2006/wordprocessingDrawing" xmlns:w10="urn:schemas-microsoft-com:office:word" xmlns:w="http://schemas.openxmlformats.org/wordprocessingml/2006/main" xmlns:w14="http://schemas.microsoft.com/office/word/2010/wordml" xmlns:w15="http://schemas.microsoft.com/office/word/2012/wordml" xmlns:w16cex="http://schemas.microsoft.com/office/word/2018/wordml/cex" xmlns:w16cid="http://schemas.microsoft.com/office/word/2016/wordml/cid" xmlns:w16="http://schemas.microsoft.com/office/word/2018/wordml" xmlns:w16du="http://schemas.microsoft.com/office/word/2023/wordml/word16du" xmlns:w16sdtdh="http://schemas.microsoft.com/office/word/2020/wordml/sdtdatahash" xmlns:w16sdtfl="http://schemas.microsoft.com/office/word/2024/wordml/sdtformatlock" xmlns:w16se="http://schemas.microsoft.com/office/word/2015/wordml/symex" xmlns:wpg="http://schemas.microsoft.com/office/word/2010/wordprocessingGroup" xmlns:wpi="http://schemas.microsoft.com/office/word/2010/wordprocessingInk" xmlns:wne="http://schemas.microsoft.com/office/word/2006/wordml" xmlns:wps="http://schemas.microsoft.com/office/word/2010/wordprocessingShape" mc:Ignorable="w14 w15 w16se w16cid w16 w16cex w16sdtdh w16sdtfl w16du wp14">
   <w:body>
     <w:p>
@@ -205,7 +236,7 @@
                 <w:b/>
                 <w:bCs/>
               </w:rPr>
-              <w:t>three tabs</w:t>
+              <w:t>four tabs</w:t>
             </w:r>
             <w:r>
               <w:t xml:space="preserve"> across the top:</w:t>
@@ -2758,7 +2789,7 @@
         <w:spacing w:after="140" w:line="276" w:lineRule="auto"/>
       </w:pPr>
       <w:r>
-        <w:t>Across the top of the editor are three tabs and a few buttons:</w:t>
+        <w:t>Across the top of the editor are four tabs and a few buttons:</w:t>
       </w:r>
     </w:p>
     <w:p>
@@ -2787,6 +2818,17 @@
           <w:bCs/>
           <w:color w:val="8B3A3A"/>
         </w:rPr>
+        <w:t>Collections</w:t>
+      </w:r>
+      <w:r>
+        <w:t xml:space="preserve">, </w:t>
+      </w:r>
+      <w:r>
+        <w:rPr>
+          <w:b/>
+          <w:bCs/>
+          <w:color w:val="8B3A3A"/>
+        </w:rPr>
         <w:t>Events</w:t>
       </w:r>
       <w:r>
@@ -2801,7 +2843,7 @@
         <w:t>Orders</w:t>
       </w:r>
       <w:r>
-        <w:t xml:space="preserve"> tabs — click these to switch between your pieces, your markets, and your online orders.</w:t>
+        <w:t xml:space="preserve"> tabs — click these to switch between your pieces, your collections, your markets, and your online orders.</w:t>
       </w:r>
     </w:p>
     <w:p>
@@ -4421,6 +4463,207 @@
         </w:tc>
       </w:tr>
     </w:tbl>
+    <w:p>
+      <w:pPr>
+        <w:pStyle w:val="Heading1"/>
+        <w:pBdr>
+          <w:bottom w:val="single" w:sz="8" w:space="4" w:color="C9956B"/>
+        </w:pBdr>
+      </w:pPr>
+      <w:r>
+        <w:t>The Collections tab — grouping pieces</w:t>
+      </w:r>
+    </w:p>
+    <w:p>
+      <w:pPr>
+        <w:spacing w:after="140" w:line="276" w:lineRule="auto"/>
+      </w:pPr>
+      <w:r>
+        <w:t xml:space="preserve">A collection is a themed group of pieces — like Nautical or Aussie Birds — that gets its own page on the website. The Collections tab lets you choose which pieces belong to each collection, and the order they appear in, without editing any files.</w:t>
+      </w:r>
+    </w:p>
+    <w:p>
+      <w:pPr>
+        <w:pStyle w:val="Heading2"/>
+      </w:pPr>
+      <w:r>
+        <w:t>Choosing a collection</w:t>
+      </w:r>
+    </w:p>
+    <w:p>
+      <w:pPr>
+        <w:spacing w:after="140" w:line="276" w:lineRule="auto"/>
+      </w:pPr>
+      <w:r>
+        <w:t xml:space="preserve">The list on the left shows every collection with its number of pieces — for example </w:t>
+      </w:r>
+      <w:r>
+        <w:rPr>
+          <w:b/>
+          <w:bCs/>
+          <w:color w:val="8B3A3A"/>
+        </w:rPr>
+        <w:t xml:space="preserve">Nautical (8)</w:t>
+      </w:r>
+      <w:r>
+        <w:t xml:space="preserve">. A collection shown in grey with “hidden on site (empty)” has no visible pieces yet, so it isn’t shown anywhere on the website. Click a collection to open it.</w:t>
+      </w:r>
+    </w:p>
+    <w:p>
+      <w:pPr>
+        <w:pStyle w:val="Heading2"/>
+      </w:pPr>
+      <w:r>
+        <w:t>Adding, removing and reordering pieces</w:t>
+      </w:r>
+    </w:p>
+    <w:p>
+      <w:pPr>
+        <w:spacing w:after="140" w:line="276" w:lineRule="auto"/>
+      </w:pPr>
+      <w:r>
+        <w:t>An open collection has two columns:</w:t>
+      </w:r>
+    </w:p>
+    <w:p>
+      <w:pPr>
+        <w:pStyle w:val="ListParagraph"/>
+        <w:numPr>
+          <w:ilvl w:val="0"/>
+          <w:numId w:val="2"/>
+        </w:numPr>
+        <w:spacing w:after="80" w:line="272" w:lineRule="auto"/>
+      </w:pPr>
+      <w:r>
+        <w:rPr>
+          <w:b/>
+          <w:bCs/>
+          <w:color w:val="8B3A3A"/>
+        </w:rPr>
+        <w:t xml:space="preserve">All pieces</w:t>
+      </w:r>
+      <w:r>
+        <w:t xml:space="preserve"> (on the left) is every piece in your gallery, with the same search and filters as the Gallery tab. Drag a piece across into the right-hand column — or click its </w:t>
+      </w:r>
+      <w:r>
+        <w:rPr>
+          <w:b/>
+          <w:bCs/>
+          <w:color w:val="8B3A3A"/>
+        </w:rPr>
+        <w:t xml:space="preserve">Add</w:t>
+      </w:r>
+      <w:r>
+        <w:t xml:space="preserve"> button — to put it in the collection.</w:t>
+      </w:r>
+    </w:p>
+    <w:p>
+      <w:pPr>
+        <w:pStyle w:val="ListParagraph"/>
+        <w:numPr>
+          <w:ilvl w:val="0"/>
+          <w:numId w:val="2"/>
+        </w:numPr>
+        <w:spacing w:after="80" w:line="272" w:lineRule="auto"/>
+      </w:pPr>
+      <w:r>
+        <w:rPr>
+          <w:b/>
+          <w:bCs/>
+          <w:color w:val="8B3A3A"/>
+        </w:rPr>
+        <w:t xml:space="preserve">Pieces in this collection</w:t>
+      </w:r>
+      <w:r>
+        <w:t xml:space="preserve"> (on the right) is what’s in the collection now, in the exact order it appears on the website. Drag pieces up or down to change that order.</w:t>
+      </w:r>
+    </w:p>
+    <w:p>
+      <w:pPr>
+        <w:pStyle w:val="ListParagraph"/>
+        <w:numPr>
+          <w:ilvl w:val="0"/>
+          <w:numId w:val="2"/>
+        </w:numPr>
+        <w:spacing w:after="80" w:line="272" w:lineRule="auto"/>
+      </w:pPr>
+      <w:r>
+        <w:rPr>
+          <w:b/>
+          <w:bCs/>
+          <w:color w:val="8B3A3A"/>
+        </w:rPr>
+        <w:t xml:space="preserve">Remove</w:t>
+      </w:r>
+      <w:r>
+        <w:t xml:space="preserve"> takes a piece out of this collection only — the piece itself stays in your gallery, untouched.</w:t>
+      </w:r>
+    </w:p>
+    <w:p>
+      <w:pPr>
+        <w:spacing w:after="140" w:line="276" w:lineRule="auto"/>
+      </w:pPr>
+      <w:r>
+        <w:t xml:space="preserve">Some pieces may be marked “hidden” — they keep their place in the collection but won’t show on the website until you make them visible again in the Gallery tab. Pieces still waiting for photos are kept too, so nothing is ever lost.</w:t>
+      </w:r>
+    </w:p>
+    <w:p>
+      <w:pPr>
+        <w:pStyle w:val="Heading2"/>
+      </w:pPr>
+      <w:r>
+        <w:t>Making a new collection</w:t>
+      </w:r>
+    </w:p>
+    <w:p>
+      <w:pPr>
+        <w:spacing w:after="140" w:line="276" w:lineRule="auto"/>
+      </w:pPr>
+      <w:r>
+        <w:t xml:space="preserve">Click </w:t>
+      </w:r>
+      <w:r>
+        <w:rPr>
+          <w:b/>
+          <w:bCs/>
+          <w:color w:val="8B3A3A"/>
+        </w:rPr>
+        <w:t xml:space="preserve">New</w:t>
+      </w:r>
+      <w:r>
+        <w:t xml:space="preserve"> and enter a title (the web address is filled in for you), an optional description, a display order and a hero image. A brand-new collection has no pieces yet, so it stays hidden on the website until you add at least one visible piece.</w:t>
+      </w:r>
+    </w:p>
+    <w:p>
+      <w:pPr>
+        <w:spacing w:after="140" w:line="276" w:lineRule="auto"/>
+      </w:pPr>
+      <w:r>
+        <w:t xml:space="preserve">As everywhere else, your changes are saved to your draft with </w:t>
+      </w:r>
+      <w:r>
+        <w:rPr>
+          <w:b/>
+          <w:bCs/>
+          <w:color w:val="8B3A3A"/>
+        </w:rPr>
+        <w:t xml:space="preserve">Save to draft</w:t>
+      </w:r>
+      <w:r>
+        <w:t xml:space="preserve"> and only go live when you click </w:t>
+      </w:r>
+      <w:r>
+        <w:rPr>
+          <w:b/>
+          <w:bCs/>
+          <w:color w:val="8B3A3A"/>
+        </w:rPr>
+        <w:t xml:space="preserve">Commit</w:t>
+      </w:r>
+      <w:r>
+        <w:t xml:space="preserve"> in the bar at the top.</w:t>
+      </w:r>
+    </w:p>
     <w:p>
       <w:pPr>
         <w:pStyle w:val="Heading1"/>
@@ -6655,7 +6898,7 @@
 </w:document>
 </file>
 
-<file path=word/endnotes.xml><?xml version="1.0" encoding="utf-8"?>
+<file path=word\endnotes.xml><?xml version="1.0" encoding="utf-8"?>
 <w:endnotes xmlns:wpc="http://schemas.microsoft.com/office/word/2010/wordprocessingCanvas" xmlns:cx="http://schemas.microsoft.com/office/drawing/2014/chartex" xmlns:cx1="http://schemas.microsoft.com/office/drawing/2015/9/8/chartex" xmlns:cx2="http://schemas.microsoft.com/office/drawing/2015/10/21/chartex" xmlns:cx3="http://schemas.microsoft.com/office/drawing/2016/5/9/chartex" xmlns:cx4="http://schemas.microsoft.com/office/drawing/2016/5/10/chartex" xmlns:cx5="http://schemas.microsoft.com/office/drawing/2016/5/11/chartex" xmlns:cx6="http://schemas.microsoft.com/office/drawing/2016/5/12/chartex" xmlns:cx7="http://schemas.microsoft.com/office/drawing/2016/5/13/chartex" xmlns:cx8="http://schemas.microsoft.com/office/drawing/2016/5/14/chartex" xmlns:mc="http://schemas.openxmlformats.org/markup-compatibility/2006" xmlns:aink="http://schemas.microsoft.com/office/drawing/2016/ink" xmlns:am3d="http://schemas.microsoft.com/office/drawing/2017/model3d" xmlns:o="urn:schemas-microsoft-com:office:office" xmlns:oel="http://schemas.microsoft.com/office/2019/extlst" xmlns:r="http://schemas.openxmlformats.org/officeDocument/2006/relationships" xmlns:m="http://schemas.openxmlformats.org/officeDocument/2006/math" xmlns:v="urn:schemas-microsoft-com:vml" xmlns:wp14="http://schemas.microsoft.com/office/word/2010/wordprocessingDrawing" xmlns:wp="http://schemas.openxmlformats.org/drawingml/2006/wordprocessingDrawing" xmlns:w10="urn:schemas-microsoft-com:office:word" xmlns:w="http://schemas.openxmlformats.org/wordprocessingml/2006/main" xmlns:w14="http://schemas.microsoft.com/office/word/2010/wordml" xmlns:w15="http://schemas.microsoft.com/office/word/2012/wordml" xmlns:w16cex="http://schemas.microsoft.com/office/word/2018/wordml/cex" xmlns:w16cid="http://schemas.microsoft.com/office/word/2016/wordml/cid" xmlns:w16="http://schemas.microsoft.com/office/word/2018/wordml" xmlns:w16du="http://schemas.microsoft.com/office/word/2023/wordml/word16du" xmlns:w16sdtdh="http://schemas.microsoft.com/office/word/2020/wordml/sdtdatahash" xmlns:w16sdtfl="http://schemas.microsoft.com/office/word/2024/wordml/sdtformatlock" xmlns:w16se="http://schemas.microsoft.com/office/word/2015/wordml/symex" xmlns:wpg="http://schemas.microsoft.com/office/word/2010/wordprocessingGroup" xmlns:wpi="http://schemas.microsoft.com/office/word/2010/wordprocessingInk" xmlns:wne="http://schemas.microsoft.com/office/word/2006/wordml" xmlns:wps="http://schemas.microsoft.com/office/word/2010/wordprocessingShape" mc:Ignorable="w14 w15 w16se w16cid w16 w16cex w16sdtdh w16sdtfl w16du wp14">
   <w:endnote w:type="separator" w:id="-1">
     <w:p>
@@ -6674,7 +6917,52 @@
 </w:endnotes>
 </file>
 
-<file path=word/footer1.xml><?xml version="1.0" encoding="utf-8"?>
+<file path=word\fontTable.xml><?xml version="1.0" encoding="utf-8"?>
+<w:fonts xmlns:mc="http://schemas.openxmlformats.org/markup-compatibility/2006" xmlns:r="http://schemas.openxmlformats.org/officeDocument/2006/relationships" xmlns:w="http://schemas.openxmlformats.org/wordprocessingml/2006/main" xmlns:w14="http://schemas.microsoft.com/office/word/2010/wordml" xmlns:w15="http://schemas.microsoft.com/office/word/2012/wordml" xmlns:w16cex="http://schemas.microsoft.com/office/word/2018/wordml/cex" xmlns:w16cid="http://schemas.microsoft.com/office/word/2016/wordml/cid" xmlns:w16="http://schemas.microsoft.com/office/word/2018/wordml" xmlns:w16du="http://schemas.microsoft.com/office/word/2023/wordml/word16du" xmlns:w16sdtdh="http://schemas.microsoft.com/office/word/2020/wordml/sdtdatahash" xmlns:w16sdtfl="http://schemas.microsoft.com/office/word/2024/wordml/sdtformatlock" xmlns:w16se="http://schemas.microsoft.com/office/word/2015/wordml/symex" mc:Ignorable="w14 w15 w16se w16cid w16 w16cex w16sdtdh w16sdtfl w16du">
+  <w:font w:name="Times New Roman">
+    <w:panose1 w:val="02020603050405020304"/>
+    <w:charset w:val="00"/>
+    <w:family w:val="roman"/>
+    <w:pitch w:val="variable"/>
+    <w:sig w:usb0="E0002EFF" w:usb1="C000785B" w:usb2="00000009" w:usb3="00000000" w:csb0="000001FF" w:csb1="00000000"/>
+  </w:font>
+  <w:font w:name="Arial">
+    <w:panose1 w:val="020B0604020202020204"/>
+    <w:charset w:val="00"/>
+    <w:family w:val="swiss"/>
+    <w:pitch w:val="variable"/>
+    <w:sig w:usb0="E0002EFF" w:usb1="C000785B" w:usb2="00000009" w:usb3="00000000" w:csb0="000001FF" w:csb1="00000000"/>
+  </w:font>
+  <w:font w:name="Georgia">
+    <w:panose1 w:val="02040502050405020303"/>
+    <w:charset w:val="00"/>
+    <w:family w:val="roman"/>
+    <w:pitch w:val="variable"/>
+    <w:sig w:usb0="00000287" w:usb1="00000000" w:usb2="00000000" w:usb3="00000000" w:csb0="0000009F" w:csb1="00000000"/>
+  </w:font>
+  <w:font w:name="Consolas">
+    <w:panose1 w:val="020B0609020204030204"/>
+    <w:charset w:val="00"/>
+    <w:family w:val="modern"/>
+    <w:pitch w:val="fixed"/>
+    <w:sig w:usb0="E00006FF" w:usb1="0000FCFF" w:usb2="00000001" w:usb3="00000000" w:csb0="0000019F" w:csb1="00000000"/>
+  </w:font>
+  <w:font w:name="Aptos Display">
+    <w:charset w:val="00"/>
+    <w:family w:val="swiss"/>
+    <w:pitch w:val="variable"/>
+    <w:sig w:usb0="20000287" w:usb1="00000003" w:usb2="00000000" w:usb3="00000000" w:csb0="0000019F" w:csb1="00000000"/>
+  </w:font>
+  <w:font w:name="Aptos">
+    <w:charset w:val="00"/>
+    <w:family w:val="swiss"/>
+    <w:pitch w:val="variable"/>
+    <w:sig w:usb0="20000287" w:usb1="00000003" w:usb2="00000000" w:usb3="00000000" w:csb0="0000019F" w:csb1="00000000"/>
+  </w:font>
+</w:fonts>
+</file>
+
+<file path=word\footer1.xml><?xml version="1.0" encoding="utf-8"?>
 <w:ftr xmlns:wpc="http://schemas.microsoft.com/office/word/2010/wordprocessingCanvas" xmlns:cx="http://schemas.microsoft.com/office/drawing/2014/chartex" xmlns:cx1="http://schemas.microsoft.com/office/drawing/2015/9/8/chartex" xmlns:cx2="http://schemas.microsoft.com/office/drawing/2015/10/21/chartex" xmlns:cx3="http://schemas.microsoft.com/office/drawing/2016/5/9/chartex" xmlns:cx4="http://schemas.microsoft.com/office/drawing/2016/5/10/chartex" xmlns:cx5="http://schemas.microsoft.com/office/drawing/2016/5/11/chartex" xmlns:cx6="http://schemas.microsoft.com/office/drawing/2016/5/12/chartex" xmlns:cx7="http://schemas.microsoft.com/office/drawing/2016/5/13/chartex" xmlns:cx8="http://schemas.microsoft.com/office/drawing/2016/5/14/chartex" xmlns:mc="http://schemas.openxmlformats.org/markup-compatibility/2006" xmlns:aink="http://schemas.microsoft.com/office/drawing/2016/ink" xmlns:am3d="http://schemas.microsoft.com/office/drawing/2017/model3d" xmlns:o="urn:schemas-microsoft-com:office:office" xmlns:oel="http://schemas.microsoft.com/office/2019/extlst" xmlns:r="http://schemas.openxmlformats.org/officeDocument/2006/relationships" xmlns:m="http://schemas.openxmlformats.org/officeDocument/2006/math" xmlns:v="urn:schemas-microsoft-com:vml" xmlns:wp14="http://schemas.microsoft.com/office/word/2010/wordprocessingDrawing" xmlns:wp="http://schemas.openxmlformats.org/drawingml/2006/wordprocessingDrawing" xmlns:w10="urn:schemas-microsoft-com:office:word" xmlns:w="http://schemas.openxmlformats.org/wordprocessingml/2006/main" xmlns:w14="http://schemas.microsoft.com/office/word/2010/wordml" xmlns:w15="http://schemas.microsoft.com/office/word/2012/wordml" xmlns:w16cex="http://schemas.microsoft.com/office/word/2018/wordml/cex" xmlns:w16cid="http://schemas.microsoft.com/office/word/2016/wordml/cid" xmlns:w16="http://schemas.microsoft.com/office/word/2018/wordml" xmlns:w16du="http://schemas.microsoft.com/office/word/2023/wordml/word16du" xmlns:w16sdtdh="http://schemas.microsoft.com/office/word/2020/wordml/sdtdatahash" xmlns:w16sdtfl="http://schemas.microsoft.com/office/word/2024/wordml/sdtformatlock" xmlns:w16se="http://schemas.microsoft.com/office/word/2015/wordml/symex" xmlns:wpg="http://schemas.microsoft.com/office/word/2010/wordprocessingGroup" xmlns:wpi="http://schemas.microsoft.com/office/word/2010/wordprocessingInk" xmlns:wne="http://schemas.microsoft.com/office/word/2006/wordml" xmlns:wps="http://schemas.microsoft.com/office/word/2010/wordprocessingShape" mc:Ignorable="w14 w15 w16se w16cid w16 w16cex w16sdtdh w16sdtfl w16du wp14">
   <w:p>
     <w:pPr>
@@ -6733,7 +7021,7 @@
 </w:ftr>
 </file>
 
-<file path=word/footnotes.xml><?xml version="1.0" encoding="utf-8"?>
+<file path=word\footnotes.xml><?xml version="1.0" encoding="utf-8"?>
 <w:footnotes xmlns:wpc="http://schemas.microsoft.com/office/word/2010/wordprocessingCanvas" xmlns:cx="http://schemas.microsoft.com/office/drawing/2014/chartex" xmlns:cx1="http://schemas.microsoft.com/office/drawing/2015/9/8/chartex" xmlns:cx2="http://schemas.microsoft.com/office/drawing/2015/10/21/chartex" xmlns:cx3="http://schemas.microsoft.com/office/drawing/2016/5/9/chartex" xmlns:cx4="http://schemas.microsoft.com/office/drawing/2016/5/10/chartex" xmlns:cx5="http://schemas.microsoft.com/office/drawing/2016/5/11/chartex" xmlns:cx6="http://schemas.microsoft.com/office/drawing/2016/5/12/chartex" xmlns:cx7="http://schemas.microsoft.com/office/drawing/2016/5/13/chartex" xmlns:cx8="http://schemas.microsoft.com/office/drawing/2016/5/14/chartex" xmlns:mc="http://schemas.openxmlformats.org/markup-compatibility/2006" xmlns:aink="http://schemas.microsoft.com/office/drawing/2016/ink" xmlns:am3d="http://schemas.microsoft.com/office/drawing/2017/model3d" xmlns:o="urn:schemas-microsoft-com:office:office" xmlns:oel="http://schemas.microsoft.com/office/2019/extlst" xmlns:r="http://schemas.openxmlformats.org/officeDocument/2006/relationships" xmlns:m="http://schemas.openxmlformats.org/officeDocument/2006/math" xmlns:v="urn:schemas-microsoft-com:vml" xmlns:wp14="http://schemas.microsoft.com/office/word/2010/wordprocessingDrawing" xmlns:wp="http://schemas.openxmlformats.org/drawingml/2006/wordprocessingDrawing" xmlns:w10="urn:schemas-microsoft-com:office:word" xmlns:w="http://schemas.openxmlformats.org/wordprocessingml/2006/main" xmlns:w14="http://schemas.microsoft.com/office/word/2010/wordml" xmlns:w15="http://schemas.microsoft.com/office/word/2012/wordml" xmlns:w16cex="http://schemas.microsoft.com/office/word/2018/wordml/cex" xmlns:w16cid="http://schemas.microsoft.com/office/word/2016/wordml/cid" xmlns:w16="http://schemas.microsoft.com/office/word/2018/wordml" xmlns:w16du="http://schemas.microsoft.com/office/word/2023/wordml/word16du" xmlns:w16sdtdh="http://schemas.microsoft.com/office/word/2020/wordml/sdtdatahash" xmlns:w16sdtfl="http://schemas.microsoft.com/office/word/2024/wordml/sdtformatlock" xmlns:w16se="http://schemas.microsoft.com/office/word/2015/wordml/symex" xmlns:wpg="http://schemas.microsoft.com/office/word/2010/wordprocessingGroup" xmlns:wpi="http://schemas.microsoft.com/office/word/2010/wordprocessingInk" xmlns:wne="http://schemas.microsoft.com/office/word/2006/wordml" xmlns:wps="http://schemas.microsoft.com/office/word/2010/wordprocessingShape" mc:Ignorable="w14 w15 w16se w16cid w16 w16cex w16sdtdh w16sdtfl w16du wp14">
   <w:footnote w:type="separator" w:id="-1">
     <w:p>
@@ -6752,7 +7040,7 @@
 </w:footnotes>
 </file>
 
-<file path=word/header1.xml><?xml version="1.0" encoding="utf-8"?>
+<file path=word\header1.xml><?xml version="1.0" encoding="utf-8"?>
 <w:hdr xmlns:wpc="http://schemas.microsoft.com/office/word/2010/wordprocessingCanvas" xmlns:cx="http://schemas.microsoft.com/office/drawing/2014/chartex" xmlns:cx1="http://schemas.microsoft.com/office/drawing/2015/9/8/chartex" xmlns:cx2="http://schemas.microsoft.com/office/drawing/2015/10/21/chartex" xmlns:cx3="http://schemas.microsoft.com/office/drawing/2016/5/9/chartex" xmlns:cx4="http://schemas.microsoft.com/office/drawing/2016/5/10/chartex" xmlns:cx5="http://schemas.microsoft.com/office/drawing/2016/5/11/chartex" xmlns:cx6="http://schemas.microsoft.com/office/drawing/2016/5/12/chartex" xmlns:cx7="http://schemas.microsoft.com/office/drawing/2016/5/13/chartex" xmlns:cx8="http://schemas.microsoft.com/office/drawing/2016/5/14/chartex" xmlns:mc="http://schemas.openxmlformats.org/markup-compatibility/2006" xmlns:aink="http://schemas.microsoft.com/office/drawing/2016/ink" xmlns:am3d="http://schemas.microsoft.com/office/drawing/2017/model3d" xmlns:o="urn:schemas-microsoft-com:office:office" xmlns:oel="http://schemas.microsoft.com/office/2019/extlst" xmlns:r="http://schemas.openxmlformats.org/officeDocument/2006/relationships" xmlns:m="http://schemas.openxmlformats.org/officeDocument/2006/math" xmlns:v="urn:schemas-microsoft-com:vml" xmlns:wp14="http://schemas.microsoft.com/office/word/2010/wordprocessingDrawing" xmlns:wp="http://schemas.openxmlformats.org/drawingml/2006/wordprocessingDrawing" xmlns:w10="urn:schemas-microsoft-com:office:word" xmlns:w="http://schemas.openxmlformats.org/wordprocessingml/2006/main" xmlns:w14="http://schemas.microsoft.com/office/word/2010/wordml" xmlns:w15="http://schemas.microsoft.com/office/word/2012/wordml" xmlns:w16cex="http://schemas.microsoft.com/office/word/2018/wordml/cex" xmlns:w16cid="http://schemas.microsoft.com/office/word/2016/wordml/cid" xmlns:w16="http://schemas.microsoft.com/office/word/2018/wordml" xmlns:w16du="http://schemas.microsoft.com/office/word/2023/wordml/word16du" xmlns:w16sdtdh="http://schemas.microsoft.com/office/word/2020/wordml/sdtdatahash" xmlns:w16sdtfl="http://schemas.microsoft.com/office/word/2024/wordml/sdtformatlock" xmlns:w16se="http://schemas.microsoft.com/office/word/2015/wordml/symex" xmlns:wpg="http://schemas.microsoft.com/office/word/2010/wordprocessingGroup" xmlns:wpi="http://schemas.microsoft.com/office/word/2010/wordprocessingInk" xmlns:wne="http://schemas.microsoft.com/office/word/2006/wordml" xmlns:wps="http://schemas.microsoft.com/office/word/2010/wordprocessingShape" mc:Ignorable="w14 w15 w16se w16cid w16 w16cex w16sdtdh w16sdtfl w16du wp14">
   <w:p>
     <w:pPr>
@@ -6773,7 +7061,7 @@
 </w:hdr>
 </file>
 
-<file path=word/numbering.xml><?xml version="1.0" encoding="utf-8"?>
+<file path=word\numbering.xml><?xml version="1.0" encoding="utf-8"?>
 <w:numbering xmlns:wpc="http://schemas.microsoft.com/office/word/2010/wordprocessingCanvas" xmlns:cx="http://schemas.microsoft.com/office/drawing/2014/chartex" xmlns:cx1="http://schemas.microsoft.com/office/drawing/2015/9/8/chartex" xmlns:cx2="http://schemas.microsoft.com/office/drawing/2015/10/21/chartex" xmlns:cx3="http://schemas.microsoft.com/office/drawing/2016/5/9/chartex" xmlns:cx4="http://schemas.microsoft.com/office/drawing/2016/5/10/chartex" xmlns:cx5="http://schemas.microsoft.com/office/drawing/2016/5/11/chartex" xmlns:cx6="http://schemas.microsoft.com/office/drawing/2016/5/12/chartex" xmlns:cx7="http://schemas.microsoft.com/office/drawing/2016/5/13/chartex" xmlns:cx8="http://schemas.microsoft.com/office/drawing/2016/5/14/chartex" xmlns:mc="http://schemas.openxmlformats.org/markup-compatibility/2006" xmlns:aink="http://schemas.microsoft.com/office/drawing/2016/ink" xmlns:am3d="http://schemas.microsoft.com/office/drawing/2017/model3d" xmlns:o="urn:schemas-microsoft-com:office:office" xmlns:oel="http://schemas.microsoft.com/office/2019/extlst" xmlns:r="http://schemas.openxmlformats.org/officeDocument/2006/relationships" xmlns:m="http://schemas.openxmlformats.org/officeDocument/2006/math" xmlns:v="urn:schemas-microsoft-com:vml" xmlns:wp14="http://schemas.microsoft.com/office/word/2010/wordprocessingDrawing" xmlns:wp="http://schemas.openxmlformats.org/drawingml/2006/wordprocessingDrawing" xmlns:w10="urn:schemas-microsoft-com:office:word" xmlns:w="http://schemas.openxmlformats.org/wordprocessingml/2006/main" xmlns:w14="http://schemas.microsoft.com/office/word/2010/wordml" xmlns:w15="http://schemas.microsoft.com/office/word/2012/wordml" xmlns:w16cex="http://schemas.microsoft.com/office/word/2018/wordml/cex" xmlns:w16cid="http://schemas.microsoft.com/office/word/2016/wordml/cid" xmlns:w16="http://schemas.microsoft.com/office/word/2018/wordml" xmlns:w16du="http://schemas.microsoft.com/office/word/2023/wordml/word16du" xmlns:w16sdtdh="http://schemas.microsoft.com/office/word/2020/wordml/sdtdatahash" xmlns:w16sdtfl="http://schemas.microsoft.com/office/word/2024/wordml/sdtformatlock" xmlns:w16se="http://schemas.microsoft.com/office/word/2015/wordml/symex" xmlns:wpg="http://schemas.microsoft.com/office/word/2010/wordprocessingGroup" xmlns:wpi="http://schemas.microsoft.com/office/word/2010/wordprocessingInk" xmlns:wne="http://schemas.microsoft.com/office/word/2006/wordml" xmlns:wps="http://schemas.microsoft.com/office/word/2010/wordprocessingShape" mc:Ignorable="w14 w15 w16se w16cid w16 w16cex w16sdtdh w16sdtfl w16du wp14">
   <w:abstractNum w:abstractNumId="0" w15:restartNumberingAfterBreak="0">
     <w:nsid w:val="08FA0409"/>
@@ -7255,7 +7543,64 @@
 </w:numbering>
 </file>
 
-<file path=word/styles.xml><?xml version="1.0" encoding="utf-8"?>
+<file path=word\settings.xml><?xml version="1.0" encoding="utf-8"?>
+<w:settings xmlns:mc="http://schemas.openxmlformats.org/markup-compatibility/2006" xmlns:o="urn:schemas-microsoft-com:office:office" xmlns:r="http://schemas.openxmlformats.org/officeDocument/2006/relationships" xmlns:m="http://schemas.openxmlformats.org/officeDocument/2006/math" xmlns:v="urn:schemas-microsoft-com:vml" xmlns:w10="urn:schemas-microsoft-com:office:word" xmlns:w="http://schemas.openxmlformats.org/wordprocessingml/2006/main" xmlns:w14="http://schemas.microsoft.com/office/word/2010/wordml" xmlns:w15="http://schemas.microsoft.com/office/word/2012/wordml" xmlns:w16cex="http://schemas.microsoft.com/office/word/2018/wordml/cex" xmlns:w16cid="http://schemas.microsoft.com/office/word/2016/wordml/cid" xmlns:w16="http://schemas.microsoft.com/office/word/2018/wordml" xmlns:w16du="http://schemas.microsoft.com/office/word/2023/wordml/word16du" xmlns:w16sdtdh="http://schemas.microsoft.com/office/word/2020/wordml/sdtdatahash" xmlns:w16sdtfl="http://schemas.microsoft.com/office/word/2024/wordml/sdtformatlock" xmlns:w16se="http://schemas.microsoft.com/office/word/2015/wordml/symex" xmlns:sl="http://schemas.openxmlformats.org/schemaLibrary/2006/main" mc:Ignorable="w14 w15 w16se w16cid w16 w16cex w16sdtdh w16sdtfl w16du">
+  <w:zoom w:percent="100"/>
+  <w:displayBackgroundShape/>
+  <w:defaultTabStop w:val="720"/>
+  <w:characterSpacingControl w:val="doNotCompress"/>
+  <w:footnotePr>
+    <w:footnote w:id="-1"/>
+    <w:footnote w:id="0"/>
+  </w:footnotePr>
+  <w:endnotePr>
+    <w:endnote w:id="-1"/>
+    <w:endnote w:id="0"/>
+  </w:endnotePr>
+  <w:compat>
+    <w:compatSetting w:name="compatibilityMode" w:uri="http://schemas.microsoft.com/office/word" w:val="15"/>
+    <w:compatSetting w:name="overrideTableStyleFontSizeAndJustification" w:uri="http://schemas.microsoft.com/office/word" w:val="1"/>
+    <w:compatSetting w:name="enableOpenTypeFeatures" w:uri="http://schemas.microsoft.com/office/word" w:val="1"/>
+    <w:compatSetting w:name="doNotFlipMirrorIndents" w:uri="http://schemas.microsoft.com/office/word" w:val="1"/>
+    <w:compatSetting w:name="differentiateMultirowTableHeaders" w:uri="http://schemas.microsoft.com/office/word" w:val="1"/>
+    <w:compatSetting w:name="useWord2013TrackBottomHyphenation" w:uri="http://schemas.microsoft.com/office/word" w:val="1"/>
+  </w:compat>
+  <w:rsids>
+    <w:rsidRoot w:val="009F11B9"/>
+    <w:rsid w:val="006C74C5"/>
+    <w:rsid w:val="009F11B9"/>
+    <w:rsid w:val="00A75614"/>
+    <w:rsid w:val="00AD4AD1"/>
+  </w:rsids>
+  <m:mathPr>
+    <m:mathFont m:val="Cambria Math"/>
+    <m:brkBin m:val="before"/>
+    <m:brkBinSub m:val="--"/>
+    <m:smallFrac m:val="0"/>
+    <m:dispDef/>
+    <m:lMargin m:val="0"/>
+    <m:rMargin m:val="0"/>
+    <m:defJc m:val="centerGroup"/>
+    <m:wrapIndent m:val="1440"/>
+    <m:intLim m:val="subSup"/>
+    <m:naryLim m:val="undOvr"/>
+  </m:mathPr>
+  <w:themeFontLang w:val="en-AU"/>
+  <w:clrSchemeMapping w:bg1="light1" w:t1="dark1" w:bg2="light2" w:t2="dark2" w:accent1="accent1" w:accent2="accent2" w:accent3="accent3" w:accent4="accent4" w:accent5="accent5" w:accent6="accent6" w:hyperlink="hyperlink" w:followedHyperlink="followedHyperlink"/>
+  <w:shapeDefaults>
+    <o:shapedefaults v:ext="edit" spidmax="1026"/>
+    <o:shapelayout v:ext="edit">
+      <o:idmap v:ext="edit" data="1"/>
+    </o:shapelayout>
+  </w:shapeDefaults>
+  <w:decimalSymbol w:val="."/>
+  <w:listSeparator w:val=","/>
+  <w14:docId w14:val="20A63227"/>
+  <w15:docId w15:val="{B489FC1D-4908-4FEF-8A1D-99DFD2C9FE6F}"/>
+</w:settings>
+</file>
+
+<file path=word\styles.xml><?xml version="1.0" encoding="utf-8"?>
 <w:styles xmlns:mc="http://schemas.openxmlformats.org/markup-compatibility/2006" xmlns:r="http://schemas.openxmlformats.org/officeDocument/2006/relationships" xmlns:w="http://schemas.openxmlformats.org/wordprocessingml/2006/main" xmlns:w14="http://schemas.microsoft.com/office/word/2010/wordml" xmlns:w15="http://schemas.microsoft.com/office/word/2012/wordml" xmlns:w16cex="http://schemas.microsoft.com/office/word/2018/wordml/cex" xmlns:w16cid="http://schemas.microsoft.com/office/word/2016/wordml/cid" xmlns:w16="http://schemas.microsoft.com/office/word/2018/wordml" xmlns:w16du="http://schemas.microsoft.com/office/word/2023/wordml/word16du" xmlns:w16sdtdh="http://schemas.microsoft.com/office/word/2020/wordml/sdtdatahash" xmlns:w16sdtfl="http://schemas.microsoft.com/office/word/2024/wordml/sdtformatlock" xmlns:w16se="http://schemas.microsoft.com/office/word/2015/wordml/symex" mc:Ignorable="w14 w15 w16se w16cid w16 w16cex w16sdtdh w16sdtfl w16du">
   <w:docDefaults>
     <w:rPrDefault>
@@ -7864,7 +8209,7 @@
 </w:styles>
 </file>
 
-<file path=word/theme/theme1.xml><?xml version="1.0" encoding="utf-8"?>
+<file path=word\theme\theme1.xml><?xml version="1.0" encoding="utf-8"?>
 <a:theme xmlns:a="http://schemas.openxmlformats.org/drawingml/2006/main" name="Office Theme">
   <a:themeElements>
     <a:clrScheme name="Office">
@@ -8177,4 +8522,8 @@
     </a:ext>
   </a:extLst>
 </a:theme>
+</file>
+
+<file path=word\webSettings.xml><?xml version="1.0" encoding="utf-8"?>
+<w:webSettings xmlns:mc="http://schemas.openxmlformats.org/markup-compatibility/2006" xmlns:r="http://schemas.openxmlformats.org/officeDocument/2006/relationships" xmlns:w="http://schemas.openxmlformats.org/wordprocessingml/2006/main" xmlns:w14="http://schemas.microsoft.com/office/word/2010/wordml" xmlns:w15="http://schemas.microsoft.com/office/word/2012/wordml" xmlns:w16cex="http://schemas.microsoft.com/office/word/2018/wordml/cex" xmlns:w16cid="http://schemas.microsoft.com/office/word/2016/wordml/cid" xmlns:w16="http://schemas.microsoft.com/office/word/2018/wordml" xmlns:w16du="http://schemas.microsoft.com/office/word/2023/wordml/word16du" xmlns:w16sdtdh="http://schemas.microsoft.com/office/word/2020/wordml/sdtdatahash" xmlns:w16sdtfl="http://schemas.microsoft.com/office/word/2024/wordml/sdtformatlock" xmlns:w16se="http://schemas.microsoft.com/office/word/2015/wordml/symex" mc:Ignorable="w14 w15 w16se w16cid w16 w16cex w16sdtdh w16sdtfl w16du"/>
 </file>
</xml_diff>